<commit_message>
Add reports workflow to Nexus DX1 app guide
Co-authored-by: benjaminzhuangbin <benjaminzhuangbin@users.noreply.github.com>
</commit_message>
<xml_diff>
--- a/docs/nexus-dx1/en/export/02-Instrument-APP-User-Guide.docx
+++ b/docs/nexus-dx1/en/export/02-Instrument-APP-User-Guide.docx
@@ -2,7 +2,7 @@
 <file path=word/document.xml><?xml version="1.0" encoding="utf-8"?>
 <w:document xmlns:w="http://schemas.openxmlformats.org/wordprocessingml/2006/main" xmlns:m="http://schemas.openxmlformats.org/officeDocument/2006/math" xmlns:r="http://schemas.openxmlformats.org/officeDocument/2006/relationships" xmlns:o="urn:schemas-microsoft-com:office:office" xmlns:v="urn:schemas-microsoft-com:vml" xmlns:w10="urn:schemas-microsoft-com:office:word" xmlns:a="http://schemas.openxmlformats.org/drawingml/2006/main" xmlns:pic="http://schemas.openxmlformats.org/drawingml/2006/picture" xmlns:wp="http://schemas.openxmlformats.org/drawingml/2006/wordprocessingDrawing">
   <w:body>
-    <w:bookmarkStart w:id="41" w:name="X112622d7f11cbc8aff1474781e7ce1fe98617de"/>
+    <w:bookmarkStart w:id="56" w:name="X112622d7f11cbc8aff1474781e7ce1fe98617de"/>
     <w:p>
       <w:pPr>
         <w:pStyle w:val="Heading1"/>
@@ -2106,7 +2106,1984 @@
     </w:tbl>
     <w:bookmarkEnd w:id="39"/>
     <w:bookmarkEnd w:id="40"/>
+    <w:bookmarkStart w:id="55" w:name="chapter-7.-reports"/>
+    <w:p>
+      <w:pPr>
+        <w:pStyle w:val="Heading2"/>
+      </w:pPr>
+      <w:r>
+        <w:t xml:space="preserve">Chapter 7. Reports</w:t>
+      </w:r>
+    </w:p>
+    <w:bookmarkStart w:id="41" w:name="overview-1"/>
+    <w:p>
+      <w:pPr>
+        <w:pStyle w:val="Heading3"/>
+      </w:pPr>
+      <w:r>
+        <w:t xml:space="preserve">7.1 Overview</w:t>
+      </w:r>
+    </w:p>
+    <w:p>
+      <w:pPr>
+        <w:pStyle w:val="FirstParagraph"/>
+      </w:pPr>
+      <w:r>
+        <w:t xml:space="preserve">The</w:t>
+      </w:r>
+      <w:r>
+        <w:t xml:space="preserve"> </w:t>
+      </w:r>
+      <w:r>
+        <w:rPr>
+          <w:bCs/>
+          <w:b/>
+        </w:rPr>
+        <w:t xml:space="preserve">Reports</w:t>
+      </w:r>
+      <w:r>
+        <w:t xml:space="preserve"> </w:t>
+      </w:r>
+      <w:r>
+        <w:t xml:space="preserve">function is used to review, open, delete, and export completed test results. Each completed analysis is saved as a report record. The operator can review the digital result data, open the full report, play back the analysis video, delete selected records, or export reports to the USB flash disk supplied with the instrument.</w:t>
+      </w:r>
+    </w:p>
+    <w:p>
+      <w:pPr>
+        <w:pStyle w:val="BodyText"/>
+      </w:pPr>
+      <w:r>
+        <w:t xml:space="preserve">The Reports screen includes two main viewing modes:</w:t>
+      </w:r>
+    </w:p>
+    <w:p>
+      <w:pPr>
+        <w:numPr>
+          <w:ilvl w:val="0"/>
+          <w:numId w:val="1011"/>
+        </w:numPr>
+        <w:pStyle w:val="Compact"/>
+      </w:pPr>
+      <w:r>
+        <w:rPr>
+          <w:bCs/>
+          <w:b/>
+        </w:rPr>
+        <w:t xml:space="preserve">Digital Results</w:t>
+      </w:r>
+      <w:r>
+        <w:t xml:space="preserve">: Displays the report list and numerical result details.</w:t>
+      </w:r>
+    </w:p>
+    <w:p>
+      <w:pPr>
+        <w:numPr>
+          <w:ilvl w:val="0"/>
+          <w:numId w:val="1011"/>
+        </w:numPr>
+        <w:pStyle w:val="Compact"/>
+      </w:pPr>
+      <w:r>
+        <w:rPr>
+          <w:bCs/>
+          <w:b/>
+        </w:rPr>
+        <w:t xml:space="preserve">Video Playback</w:t>
+      </w:r>
+      <w:r>
+        <w:t xml:space="preserve">: Displays the recorded microscopic video of the selected test.</w:t>
+      </w:r>
+    </w:p>
+    <w:p>
+      <w:pPr>
+        <w:pStyle w:val="FirstParagraph"/>
+      </w:pPr>
+      <w:r>
+        <w:t xml:space="preserve">The right-side function buttons include:</w:t>
+      </w:r>
+    </w:p>
+    <w:p>
+      <w:pPr>
+        <w:numPr>
+          <w:ilvl w:val="0"/>
+          <w:numId w:val="1012"/>
+        </w:numPr>
+        <w:pStyle w:val="Compact"/>
+      </w:pPr>
+      <w:r>
+        <w:rPr>
+          <w:bCs/>
+          <w:b/>
+        </w:rPr>
+        <w:t xml:space="preserve">Report List</w:t>
+      </w:r>
+    </w:p>
+    <w:p>
+      <w:pPr>
+        <w:numPr>
+          <w:ilvl w:val="0"/>
+          <w:numId w:val="1012"/>
+        </w:numPr>
+        <w:pStyle w:val="Compact"/>
+      </w:pPr>
+      <w:r>
+        <w:rPr>
+          <w:bCs/>
+          <w:b/>
+        </w:rPr>
+        <w:t xml:space="preserve">Full Report</w:t>
+      </w:r>
+    </w:p>
+    <w:p>
+      <w:pPr>
+        <w:numPr>
+          <w:ilvl w:val="0"/>
+          <w:numId w:val="1012"/>
+        </w:numPr>
+        <w:pStyle w:val="Compact"/>
+      </w:pPr>
+      <w:r>
+        <w:rPr>
+          <w:bCs/>
+          <w:b/>
+        </w:rPr>
+        <w:t xml:space="preserve">Delete</w:t>
+      </w:r>
+    </w:p>
+    <w:p>
+      <w:pPr>
+        <w:numPr>
+          <w:ilvl w:val="0"/>
+          <w:numId w:val="1012"/>
+        </w:numPr>
+        <w:pStyle w:val="Compact"/>
+      </w:pPr>
+      <w:r>
+        <w:rPr>
+          <w:bCs/>
+          <w:b/>
+        </w:rPr>
+        <w:t xml:space="preserve">Export</w:t>
+      </w:r>
+    </w:p>
     <w:bookmarkEnd w:id="41"/>
+    <w:bookmarkStart w:id="42" w:name="open-the-reports-function"/>
+    <w:p>
+      <w:pPr>
+        <w:pStyle w:val="Heading3"/>
+      </w:pPr>
+      <w:r>
+        <w:t xml:space="preserve">7.2 Open the Reports Function</w:t>
+      </w:r>
+    </w:p>
+    <w:p>
+      <w:pPr>
+        <w:numPr>
+          <w:ilvl w:val="0"/>
+          <w:numId w:val="1013"/>
+        </w:numPr>
+        <w:pStyle w:val="Compact"/>
+      </w:pPr>
+      <w:r>
+        <w:t xml:space="preserve">Tap</w:t>
+      </w:r>
+      <w:r>
+        <w:t xml:space="preserve"> </w:t>
+      </w:r>
+      <w:r>
+        <w:rPr>
+          <w:bCs/>
+          <w:b/>
+        </w:rPr>
+        <w:t xml:space="preserve">Reports</w:t>
+      </w:r>
+      <w:r>
+        <w:t xml:space="preserve"> </w:t>
+      </w:r>
+      <w:r>
+        <w:t xml:space="preserve">on the left navigation bar.</w:t>
+      </w:r>
+    </w:p>
+    <w:p>
+      <w:pPr>
+        <w:numPr>
+          <w:ilvl w:val="0"/>
+          <w:numId w:val="1013"/>
+        </w:numPr>
+        <w:pStyle w:val="Compact"/>
+      </w:pPr>
+      <w:r>
+        <w:t xml:space="preserve">The system enters the Reports function area.</w:t>
+      </w:r>
+    </w:p>
+    <w:p>
+      <w:pPr>
+        <w:numPr>
+          <w:ilvl w:val="0"/>
+          <w:numId w:val="1013"/>
+        </w:numPr>
+        <w:pStyle w:val="Compact"/>
+      </w:pPr>
+      <w:r>
+        <w:t xml:space="preserve">Tap</w:t>
+      </w:r>
+      <w:r>
+        <w:t xml:space="preserve"> </w:t>
+      </w:r>
+      <w:r>
+        <w:rPr>
+          <w:bCs/>
+          <w:b/>
+        </w:rPr>
+        <w:t xml:space="preserve">Report List</w:t>
+      </w:r>
+      <w:r>
+        <w:t xml:space="preserve"> </w:t>
+      </w:r>
+      <w:r>
+        <w:t xml:space="preserve">if the report list is not already displayed.</w:t>
+      </w:r>
+    </w:p>
+    <w:p>
+      <w:pPr>
+        <w:numPr>
+          <w:ilvl w:val="0"/>
+          <w:numId w:val="1013"/>
+        </w:numPr>
+        <w:pStyle w:val="Compact"/>
+      </w:pPr>
+      <w:r>
+        <w:t xml:space="preserve">Confirm that</w:t>
+      </w:r>
+      <w:r>
+        <w:t xml:space="preserve"> </w:t>
+      </w:r>
+      <w:r>
+        <w:rPr>
+          <w:bCs/>
+          <w:b/>
+        </w:rPr>
+        <w:t xml:space="preserve">Digital Results</w:t>
+      </w:r>
+      <w:r>
+        <w:t xml:space="preserve"> </w:t>
+      </w:r>
+      <w:r>
+        <w:t xml:space="preserve">is selected at the top of the screen.</w:t>
+      </w:r>
+    </w:p>
+    <w:p>
+      <w:pPr>
+        <w:pStyle w:val="FirstParagraph"/>
+      </w:pPr>
+      <w:r>
+        <w:t xml:space="preserve">The main area displays all saved test results in a list.</w:t>
+      </w:r>
+    </w:p>
+    <w:p>
+      <w:pPr>
+        <w:pStyle w:val="BodyText"/>
+      </w:pPr>
+      <w:r>
+        <w:rPr>
+          <w:bCs/>
+          <w:b/>
+        </w:rPr>
+        <w:t xml:space="preserve">Figure 7-1. Reports screen - Report List and Digital Results</w:t>
+      </w:r>
+      <w:r>
+        <w:br/>
+      </w:r>
+      <w:r>
+        <w:rPr>
+          <w:iCs/>
+          <w:i/>
+        </w:rPr>
+        <w:t xml:space="preserve">[Insert screenshot: report list showing saved test results]</w:t>
+      </w:r>
+    </w:p>
+    <w:bookmarkEnd w:id="42"/>
+    <w:bookmarkStart w:id="43" w:name="report-list"/>
+    <w:p>
+      <w:pPr>
+        <w:pStyle w:val="Heading3"/>
+      </w:pPr>
+      <w:r>
+        <w:t xml:space="preserve">7.3 Report List</w:t>
+      </w:r>
+    </w:p>
+    <w:p>
+      <w:pPr>
+        <w:pStyle w:val="FirstParagraph"/>
+      </w:pPr>
+      <w:r>
+        <w:t xml:space="preserve">The</w:t>
+      </w:r>
+      <w:r>
+        <w:t xml:space="preserve"> </w:t>
+      </w:r>
+      <w:r>
+        <w:rPr>
+          <w:bCs/>
+          <w:b/>
+        </w:rPr>
+        <w:t xml:space="preserve">Report List</w:t>
+      </w:r>
+      <w:r>
+        <w:t xml:space="preserve"> </w:t>
+      </w:r>
+      <w:r>
+        <w:t xml:space="preserve">displays saved test records. Each row represents one completed test.</w:t>
+      </w:r>
+    </w:p>
+    <w:p>
+      <w:pPr>
+        <w:pStyle w:val="BodyText"/>
+      </w:pPr>
+      <w:r>
+        <w:t xml:space="preserve">Typical columns include:</w:t>
+      </w:r>
+    </w:p>
+    <w:p>
+      <w:pPr>
+        <w:numPr>
+          <w:ilvl w:val="0"/>
+          <w:numId w:val="1014"/>
+        </w:numPr>
+        <w:pStyle w:val="Compact"/>
+      </w:pPr>
+      <w:r>
+        <w:rPr>
+          <w:bCs/>
+          <w:b/>
+        </w:rPr>
+        <w:t xml:space="preserve">Ref.</w:t>
+      </w:r>
+    </w:p>
+    <w:p>
+      <w:pPr>
+        <w:numPr>
+          <w:ilvl w:val="0"/>
+          <w:numId w:val="1014"/>
+        </w:numPr>
+        <w:pStyle w:val="Compact"/>
+      </w:pPr>
+      <w:r>
+        <w:rPr>
+          <w:bCs/>
+          <w:b/>
+        </w:rPr>
+        <w:t xml:space="preserve">Date</w:t>
+      </w:r>
+    </w:p>
+    <w:p>
+      <w:pPr>
+        <w:numPr>
+          <w:ilvl w:val="0"/>
+          <w:numId w:val="1014"/>
+        </w:numPr>
+        <w:pStyle w:val="Compact"/>
+      </w:pPr>
+      <w:r>
+        <w:rPr>
+          <w:bCs/>
+          <w:b/>
+        </w:rPr>
+        <w:t xml:space="preserve">Time</w:t>
+      </w:r>
+    </w:p>
+    <w:p>
+      <w:pPr>
+        <w:numPr>
+          <w:ilvl w:val="0"/>
+          <w:numId w:val="1014"/>
+        </w:numPr>
+        <w:pStyle w:val="Compact"/>
+      </w:pPr>
+      <w:r>
+        <w:rPr>
+          <w:bCs/>
+          <w:b/>
+        </w:rPr>
+        <w:t xml:space="preserve">Patient Name</w:t>
+      </w:r>
+    </w:p>
+    <w:p>
+      <w:pPr>
+        <w:numPr>
+          <w:ilvl w:val="0"/>
+          <w:numId w:val="1014"/>
+        </w:numPr>
+        <w:pStyle w:val="Compact"/>
+      </w:pPr>
+      <w:r>
+        <w:rPr>
+          <w:bCs/>
+          <w:b/>
+        </w:rPr>
+        <w:t xml:space="preserve">Patient ID</w:t>
+      </w:r>
+    </w:p>
+    <w:p>
+      <w:pPr>
+        <w:numPr>
+          <w:ilvl w:val="0"/>
+          <w:numId w:val="1014"/>
+        </w:numPr>
+        <w:pStyle w:val="Compact"/>
+      </w:pPr>
+      <w:r>
+        <w:rPr>
+          <w:bCs/>
+          <w:b/>
+        </w:rPr>
+        <w:t xml:space="preserve">CONC. Total (M/ml)</w:t>
+      </w:r>
+    </w:p>
+    <w:p>
+      <w:pPr>
+        <w:numPr>
+          <w:ilvl w:val="0"/>
+          <w:numId w:val="1014"/>
+        </w:numPr>
+        <w:pStyle w:val="Compact"/>
+      </w:pPr>
+      <w:r>
+        <w:rPr>
+          <w:bCs/>
+          <w:b/>
+        </w:rPr>
+        <w:t xml:space="preserve">MOT Motile (%)</w:t>
+      </w:r>
+    </w:p>
+    <w:p>
+      <w:pPr>
+        <w:numPr>
+          <w:ilvl w:val="0"/>
+          <w:numId w:val="1014"/>
+        </w:numPr>
+        <w:pStyle w:val="Compact"/>
+      </w:pPr>
+      <w:r>
+        <w:rPr>
+          <w:bCs/>
+          <w:b/>
+        </w:rPr>
+        <w:t xml:space="preserve">MOR Normal (%)</w:t>
+      </w:r>
+    </w:p>
+    <w:p>
+      <w:pPr>
+        <w:pStyle w:val="FirstParagraph"/>
+      </w:pPr>
+      <w:r>
+        <w:t xml:space="preserve">To select a report, tap one row in the list. The selected row is used for</w:t>
+      </w:r>
+      <w:r>
+        <w:t xml:space="preserve"> </w:t>
+      </w:r>
+      <w:r>
+        <w:rPr>
+          <w:bCs/>
+          <w:b/>
+        </w:rPr>
+        <w:t xml:space="preserve">Full Report</w:t>
+      </w:r>
+      <w:r>
+        <w:t xml:space="preserve">,</w:t>
+      </w:r>
+      <w:r>
+        <w:t xml:space="preserve"> </w:t>
+      </w:r>
+      <w:r>
+        <w:rPr>
+          <w:bCs/>
+          <w:b/>
+        </w:rPr>
+        <w:t xml:space="preserve">Delete</w:t>
+      </w:r>
+      <w:r>
+        <w:t xml:space="preserve">, and</w:t>
+      </w:r>
+      <w:r>
+        <w:t xml:space="preserve"> </w:t>
+      </w:r>
+      <w:r>
+        <w:rPr>
+          <w:bCs/>
+          <w:b/>
+        </w:rPr>
+        <w:t xml:space="preserve">Video Playback</w:t>
+      </w:r>
+      <w:r>
+        <w:t xml:space="preserve"> </w:t>
+      </w:r>
+      <w:r>
+        <w:t xml:space="preserve">operations.</w:t>
+      </w:r>
+    </w:p>
+    <w:bookmarkEnd w:id="43"/>
+    <w:bookmarkStart w:id="44" w:name="open-a-full-report"/>
+    <w:p>
+      <w:pPr>
+        <w:pStyle w:val="Heading3"/>
+      </w:pPr>
+      <w:r>
+        <w:t xml:space="preserve">7.4 Open a Full Report</w:t>
+      </w:r>
+    </w:p>
+    <w:p>
+      <w:pPr>
+        <w:pStyle w:val="FirstParagraph"/>
+      </w:pPr>
+      <w:r>
+        <w:t xml:space="preserve">To open the full report of a selected result:</w:t>
+      </w:r>
+    </w:p>
+    <w:p>
+      <w:pPr>
+        <w:numPr>
+          <w:ilvl w:val="0"/>
+          <w:numId w:val="1015"/>
+        </w:numPr>
+        <w:pStyle w:val="Compact"/>
+      </w:pPr>
+      <w:r>
+        <w:t xml:space="preserve">Enter</w:t>
+      </w:r>
+      <w:r>
+        <w:t xml:space="preserve"> </w:t>
+      </w:r>
+      <w:r>
+        <w:rPr>
+          <w:bCs/>
+          <w:b/>
+        </w:rPr>
+        <w:t xml:space="preserve">Reports</w:t>
+      </w:r>
+      <w:r>
+        <w:t xml:space="preserve">.</w:t>
+      </w:r>
+    </w:p>
+    <w:p>
+      <w:pPr>
+        <w:numPr>
+          <w:ilvl w:val="0"/>
+          <w:numId w:val="1015"/>
+        </w:numPr>
+        <w:pStyle w:val="Compact"/>
+      </w:pPr>
+      <w:r>
+        <w:t xml:space="preserve">Tap</w:t>
+      </w:r>
+      <w:r>
+        <w:t xml:space="preserve"> </w:t>
+      </w:r>
+      <w:r>
+        <w:rPr>
+          <w:bCs/>
+          <w:b/>
+        </w:rPr>
+        <w:t xml:space="preserve">Report List</w:t>
+      </w:r>
+      <w:r>
+        <w:t xml:space="preserve">.</w:t>
+      </w:r>
+    </w:p>
+    <w:p>
+      <w:pPr>
+        <w:numPr>
+          <w:ilvl w:val="0"/>
+          <w:numId w:val="1015"/>
+        </w:numPr>
+        <w:pStyle w:val="Compact"/>
+      </w:pPr>
+      <w:r>
+        <w:t xml:space="preserve">Select one report row from the list.</w:t>
+      </w:r>
+    </w:p>
+    <w:p>
+      <w:pPr>
+        <w:numPr>
+          <w:ilvl w:val="0"/>
+          <w:numId w:val="1015"/>
+        </w:numPr>
+        <w:pStyle w:val="Compact"/>
+      </w:pPr>
+      <w:r>
+        <w:t xml:space="preserve">Tap</w:t>
+      </w:r>
+      <w:r>
+        <w:t xml:space="preserve"> </w:t>
+      </w:r>
+      <w:r>
+        <w:rPr>
+          <w:bCs/>
+          <w:b/>
+        </w:rPr>
+        <w:t xml:space="preserve">Full Report</w:t>
+      </w:r>
+      <w:r>
+        <w:t xml:space="preserve"> </w:t>
+      </w:r>
+      <w:r>
+        <w:t xml:space="preserve">on the right side.</w:t>
+      </w:r>
+    </w:p>
+    <w:p>
+      <w:pPr>
+        <w:pStyle w:val="FirstParagraph"/>
+      </w:pPr>
+      <w:r>
+        <w:t xml:space="preserve">The screen changes from the report list to the selected report’s digital result view.</w:t>
+      </w:r>
+    </w:p>
+    <w:p>
+      <w:pPr>
+        <w:pStyle w:val="BodyText"/>
+      </w:pPr>
+      <w:r>
+        <w:rPr>
+          <w:bCs/>
+          <w:b/>
+        </w:rPr>
+        <w:t xml:space="preserve">Figure 7-2. Full Report - Digital Results</w:t>
+      </w:r>
+      <w:r>
+        <w:br/>
+      </w:r>
+      <w:r>
+        <w:rPr>
+          <w:iCs/>
+          <w:i/>
+        </w:rPr>
+        <w:t xml:space="preserve">[Insert screenshot: selected report digital result view]</w:t>
+      </w:r>
+    </w:p>
+    <w:bookmarkEnd w:id="44"/>
+    <w:bookmarkStart w:id="49" w:name="review-digital-result-data"/>
+    <w:p>
+      <w:pPr>
+        <w:pStyle w:val="Heading3"/>
+      </w:pPr>
+      <w:r>
+        <w:t xml:space="preserve">7.5 Review Digital Result Data</w:t>
+      </w:r>
+    </w:p>
+    <w:p>
+      <w:pPr>
+        <w:pStyle w:val="FirstParagraph"/>
+      </w:pPr>
+      <w:r>
+        <w:t xml:space="preserve">In the full report view, the patient and sample information is shown in the upper part of the screen. The digital result data is shown in the lower part of the screen.</w:t>
+      </w:r>
+    </w:p>
+    <w:p>
+      <w:pPr>
+        <w:pStyle w:val="BodyText"/>
+      </w:pPr>
+      <w:r>
+        <w:t xml:space="preserve">The operator can switch between the following result tabs:</w:t>
+      </w:r>
+    </w:p>
+    <w:p>
+      <w:pPr>
+        <w:numPr>
+          <w:ilvl w:val="0"/>
+          <w:numId w:val="1016"/>
+        </w:numPr>
+        <w:pStyle w:val="Compact"/>
+      </w:pPr>
+      <w:r>
+        <w:rPr>
+          <w:bCs/>
+          <w:b/>
+        </w:rPr>
+        <w:t xml:space="preserve">Conc. &amp; Motility</w:t>
+      </w:r>
+    </w:p>
+    <w:p>
+      <w:pPr>
+        <w:numPr>
+          <w:ilvl w:val="0"/>
+          <w:numId w:val="1016"/>
+        </w:numPr>
+        <w:pStyle w:val="Compact"/>
+      </w:pPr>
+      <w:r>
+        <w:rPr>
+          <w:bCs/>
+          <w:b/>
+        </w:rPr>
+        <w:t xml:space="preserve">Kinematics</w:t>
+      </w:r>
+    </w:p>
+    <w:p>
+      <w:pPr>
+        <w:numPr>
+          <w:ilvl w:val="0"/>
+          <w:numId w:val="1016"/>
+        </w:numPr>
+        <w:pStyle w:val="Compact"/>
+      </w:pPr>
+      <w:r>
+        <w:rPr>
+          <w:bCs/>
+          <w:b/>
+        </w:rPr>
+        <w:t xml:space="preserve">Morphology</w:t>
+      </w:r>
+    </w:p>
+    <w:p>
+      <w:pPr>
+        <w:numPr>
+          <w:ilvl w:val="0"/>
+          <w:numId w:val="1016"/>
+        </w:numPr>
+        <w:pStyle w:val="Compact"/>
+      </w:pPr>
+      <w:r>
+        <w:rPr>
+          <w:bCs/>
+          <w:b/>
+        </w:rPr>
+        <w:t xml:space="preserve">Graph</w:t>
+      </w:r>
+    </w:p>
+    <w:p>
+      <w:pPr>
+        <w:pStyle w:val="FirstParagraph"/>
+      </w:pPr>
+      <w:r>
+        <w:t xml:space="preserve">Tap each tab to review the corresponding result category for the selected test.</w:t>
+      </w:r>
+    </w:p>
+    <w:bookmarkStart w:id="45" w:name="conc.-motility-1"/>
+    <w:p>
+      <w:pPr>
+        <w:pStyle w:val="Heading4"/>
+      </w:pPr>
+      <w:r>
+        <w:t xml:space="preserve">7.5.1 Conc. &amp; Motility</w:t>
+      </w:r>
+    </w:p>
+    <w:p>
+      <w:pPr>
+        <w:pStyle w:val="FirstParagraph"/>
+      </w:pPr>
+      <w:r>
+        <w:t xml:space="preserve">The</w:t>
+      </w:r>
+      <w:r>
+        <w:t xml:space="preserve"> </w:t>
+      </w:r>
+      <w:r>
+        <w:rPr>
+          <w:bCs/>
+          <w:b/>
+        </w:rPr>
+        <w:t xml:space="preserve">Conc. &amp; Motility</w:t>
+      </w:r>
+      <w:r>
+        <w:t xml:space="preserve"> </w:t>
+      </w:r>
+      <w:r>
+        <w:t xml:space="preserve">tab displays concentration and motility results, such as total concentration, immotile sperm, motile sperm, percentage of total, WHO 6th Edition reference information, and confidence interval information where available.</w:t>
+      </w:r>
+    </w:p>
+    <w:bookmarkEnd w:id="45"/>
+    <w:bookmarkStart w:id="46" w:name="kinematics-1"/>
+    <w:p>
+      <w:pPr>
+        <w:pStyle w:val="Heading4"/>
+      </w:pPr>
+      <w:r>
+        <w:t xml:space="preserve">7.5.2 Kinematics</w:t>
+      </w:r>
+    </w:p>
+    <w:p>
+      <w:pPr>
+        <w:pStyle w:val="FirstParagraph"/>
+      </w:pPr>
+      <w:r>
+        <w:t xml:space="preserve">The</w:t>
+      </w:r>
+      <w:r>
+        <w:t xml:space="preserve"> </w:t>
+      </w:r>
+      <w:r>
+        <w:rPr>
+          <w:bCs/>
+          <w:b/>
+        </w:rPr>
+        <w:t xml:space="preserve">Kinematics</w:t>
+      </w:r>
+      <w:r>
+        <w:t xml:space="preserve"> </w:t>
+      </w:r>
+      <w:r>
+        <w:t xml:space="preserve">tab displays sperm motion parameters calculated by the system. These values describe the movement characteristics of the analyzed sperm cells.</w:t>
+      </w:r>
+    </w:p>
+    <w:bookmarkEnd w:id="46"/>
+    <w:bookmarkStart w:id="47" w:name="morphology-1"/>
+    <w:p>
+      <w:pPr>
+        <w:pStyle w:val="Heading4"/>
+      </w:pPr>
+      <w:r>
+        <w:t xml:space="preserve">7.5.3 Morphology</w:t>
+      </w:r>
+    </w:p>
+    <w:p>
+      <w:pPr>
+        <w:pStyle w:val="FirstParagraph"/>
+      </w:pPr>
+      <w:r>
+        <w:t xml:space="preserve">The</w:t>
+      </w:r>
+      <w:r>
+        <w:t xml:space="preserve"> </w:t>
+      </w:r>
+      <w:r>
+        <w:rPr>
+          <w:bCs/>
+          <w:b/>
+        </w:rPr>
+        <w:t xml:space="preserve">Morphology</w:t>
+      </w:r>
+      <w:r>
+        <w:t xml:space="preserve"> </w:t>
+      </w:r>
+      <w:r>
+        <w:t xml:space="preserve">tab displays morphology-related analysis results for the selected test.</w:t>
+      </w:r>
+    </w:p>
+    <w:bookmarkEnd w:id="47"/>
+    <w:bookmarkStart w:id="48" w:name="graph-1"/>
+    <w:p>
+      <w:pPr>
+        <w:pStyle w:val="Heading4"/>
+      </w:pPr>
+      <w:r>
+        <w:t xml:space="preserve">7.5.4 Graph</w:t>
+      </w:r>
+    </w:p>
+    <w:p>
+      <w:pPr>
+        <w:pStyle w:val="FirstParagraph"/>
+      </w:pPr>
+      <w:r>
+        <w:t xml:space="preserve">The</w:t>
+      </w:r>
+      <w:r>
+        <w:t xml:space="preserve"> </w:t>
+      </w:r>
+      <w:r>
+        <w:rPr>
+          <w:bCs/>
+          <w:b/>
+        </w:rPr>
+        <w:t xml:space="preserve">Graph</w:t>
+      </w:r>
+      <w:r>
+        <w:t xml:space="preserve"> </w:t>
+      </w:r>
+      <w:r>
+        <w:t xml:space="preserve">tab displays graphical summaries of the selected result, such as motility and morphology charts.</w:t>
+      </w:r>
+    </w:p>
+    <w:p>
+      <w:pPr>
+        <w:pStyle w:val="BodyText"/>
+      </w:pPr>
+      <w:r>
+        <w:rPr>
+          <w:bCs/>
+          <w:b/>
+        </w:rPr>
+        <w:t xml:space="preserve">Figure 7-3. Full Report - Graph tab</w:t>
+      </w:r>
+      <w:r>
+        <w:br/>
+      </w:r>
+      <w:r>
+        <w:rPr>
+          <w:iCs/>
+          <w:i/>
+        </w:rPr>
+        <w:t xml:space="preserve">[Insert screenshot: graph view showing motility and morphology charts]</w:t>
+      </w:r>
+    </w:p>
+    <w:bookmarkEnd w:id="48"/>
+    <w:bookmarkEnd w:id="49"/>
+    <w:bookmarkStart w:id="50" w:name="video-playback"/>
+    <w:p>
+      <w:pPr>
+        <w:pStyle w:val="Heading3"/>
+      </w:pPr>
+      <w:r>
+        <w:t xml:space="preserve">7.6 Video Playback</w:t>
+      </w:r>
+    </w:p>
+    <w:p>
+      <w:pPr>
+        <w:pStyle w:val="FirstParagraph"/>
+      </w:pPr>
+      <w:r>
+        <w:t xml:space="preserve">The operator can review the recorded microscopic video for a selected test.</w:t>
+      </w:r>
+    </w:p>
+    <w:p>
+      <w:pPr>
+        <w:pStyle w:val="BodyText"/>
+      </w:pPr>
+      <w:r>
+        <w:t xml:space="preserve">To open video playback:</w:t>
+      </w:r>
+    </w:p>
+    <w:p>
+      <w:pPr>
+        <w:numPr>
+          <w:ilvl w:val="0"/>
+          <w:numId w:val="1017"/>
+        </w:numPr>
+        <w:pStyle w:val="Compact"/>
+      </w:pPr>
+      <w:r>
+        <w:t xml:space="preserve">Open</w:t>
+      </w:r>
+      <w:r>
+        <w:t xml:space="preserve"> </w:t>
+      </w:r>
+      <w:r>
+        <w:rPr>
+          <w:bCs/>
+          <w:b/>
+        </w:rPr>
+        <w:t xml:space="preserve">Reports</w:t>
+      </w:r>
+      <w:r>
+        <w:t xml:space="preserve">.</w:t>
+      </w:r>
+    </w:p>
+    <w:p>
+      <w:pPr>
+        <w:numPr>
+          <w:ilvl w:val="0"/>
+          <w:numId w:val="1017"/>
+        </w:numPr>
+        <w:pStyle w:val="Compact"/>
+      </w:pPr>
+      <w:r>
+        <w:t xml:space="preserve">Select a report from the report list, or open the report in</w:t>
+      </w:r>
+      <w:r>
+        <w:t xml:space="preserve"> </w:t>
+      </w:r>
+      <w:r>
+        <w:rPr>
+          <w:bCs/>
+          <w:b/>
+        </w:rPr>
+        <w:t xml:space="preserve">Full Report</w:t>
+      </w:r>
+      <w:r>
+        <w:t xml:space="preserve"> </w:t>
+      </w:r>
+      <w:r>
+        <w:t xml:space="preserve">view.</w:t>
+      </w:r>
+    </w:p>
+    <w:p>
+      <w:pPr>
+        <w:numPr>
+          <w:ilvl w:val="0"/>
+          <w:numId w:val="1017"/>
+        </w:numPr>
+        <w:pStyle w:val="Compact"/>
+      </w:pPr>
+      <w:r>
+        <w:t xml:space="preserve">Tap</w:t>
+      </w:r>
+      <w:r>
+        <w:t xml:space="preserve"> </w:t>
+      </w:r>
+      <w:r>
+        <w:rPr>
+          <w:bCs/>
+          <w:b/>
+        </w:rPr>
+        <w:t xml:space="preserve">Video Playback</w:t>
+      </w:r>
+      <w:r>
+        <w:t xml:space="preserve"> </w:t>
+      </w:r>
+      <w:r>
+        <w:t xml:space="preserve">at the top of the screen.</w:t>
+      </w:r>
+    </w:p>
+    <w:p>
+      <w:pPr>
+        <w:pStyle w:val="FirstParagraph"/>
+      </w:pPr>
+      <w:r>
+        <w:t xml:space="preserve">The screen displays the microscopic video recorded during analysis.</w:t>
+      </w:r>
+    </w:p>
+    <w:p>
+      <w:pPr>
+        <w:pStyle w:val="BodyText"/>
+      </w:pPr>
+      <w:r>
+        <w:rPr>
+          <w:bCs/>
+          <w:b/>
+        </w:rPr>
+        <w:t xml:space="preserve">Figure 7-4. Video Playback</w:t>
+      </w:r>
+      <w:r>
+        <w:br/>
+      </w:r>
+      <w:r>
+        <w:rPr>
+          <w:iCs/>
+          <w:i/>
+        </w:rPr>
+        <w:t xml:space="preserve">[Insert screenshot: microscopic video playback view]</w:t>
+      </w:r>
+    </w:p>
+    <w:p>
+      <w:pPr>
+        <w:pStyle w:val="BodyText"/>
+      </w:pPr>
+      <w:r>
+        <w:t xml:space="preserve">Use video playback to visually review the analyzed sample image. This function is helpful for record review, training, and troubleshooting.</w:t>
+      </w:r>
+    </w:p>
+    <w:bookmarkEnd w:id="50"/>
+    <w:bookmarkStart w:id="51" w:name="delete-a-report"/>
+    <w:p>
+      <w:pPr>
+        <w:pStyle w:val="Heading3"/>
+      </w:pPr>
+      <w:r>
+        <w:t xml:space="preserve">7.7 Delete a Report</w:t>
+      </w:r>
+    </w:p>
+    <w:p>
+      <w:pPr>
+        <w:pStyle w:val="FirstParagraph"/>
+      </w:pPr>
+      <w:r>
+        <w:t xml:space="preserve">To delete a saved report:</w:t>
+      </w:r>
+    </w:p>
+    <w:p>
+      <w:pPr>
+        <w:numPr>
+          <w:ilvl w:val="0"/>
+          <w:numId w:val="1018"/>
+        </w:numPr>
+        <w:pStyle w:val="Compact"/>
+      </w:pPr>
+      <w:r>
+        <w:t xml:space="preserve">Tap</w:t>
+      </w:r>
+      <w:r>
+        <w:t xml:space="preserve"> </w:t>
+      </w:r>
+      <w:r>
+        <w:rPr>
+          <w:bCs/>
+          <w:b/>
+        </w:rPr>
+        <w:t xml:space="preserve">Reports</w:t>
+      </w:r>
+      <w:r>
+        <w:t xml:space="preserve"> </w:t>
+      </w:r>
+      <w:r>
+        <w:t xml:space="preserve">on the left navigation bar.</w:t>
+      </w:r>
+    </w:p>
+    <w:p>
+      <w:pPr>
+        <w:numPr>
+          <w:ilvl w:val="0"/>
+          <w:numId w:val="1018"/>
+        </w:numPr>
+        <w:pStyle w:val="Compact"/>
+      </w:pPr>
+      <w:r>
+        <w:t xml:space="preserve">Tap</w:t>
+      </w:r>
+      <w:r>
+        <w:t xml:space="preserve"> </w:t>
+      </w:r>
+      <w:r>
+        <w:rPr>
+          <w:bCs/>
+          <w:b/>
+        </w:rPr>
+        <w:t xml:space="preserve">Report List</w:t>
+      </w:r>
+      <w:r>
+        <w:t xml:space="preserve">.</w:t>
+      </w:r>
+    </w:p>
+    <w:p>
+      <w:pPr>
+        <w:numPr>
+          <w:ilvl w:val="0"/>
+          <w:numId w:val="1018"/>
+        </w:numPr>
+        <w:pStyle w:val="Compact"/>
+      </w:pPr>
+      <w:r>
+        <w:t xml:space="preserve">Select the report row that should be deleted.</w:t>
+      </w:r>
+    </w:p>
+    <w:p>
+      <w:pPr>
+        <w:numPr>
+          <w:ilvl w:val="0"/>
+          <w:numId w:val="1018"/>
+        </w:numPr>
+        <w:pStyle w:val="Compact"/>
+      </w:pPr>
+      <w:r>
+        <w:t xml:space="preserve">Tap</w:t>
+      </w:r>
+      <w:r>
+        <w:t xml:space="preserve"> </w:t>
+      </w:r>
+      <w:r>
+        <w:rPr>
+          <w:bCs/>
+          <w:b/>
+        </w:rPr>
+        <w:t xml:space="preserve">Delete</w:t>
+      </w:r>
+      <w:r>
+        <w:t xml:space="preserve"> </w:t>
+      </w:r>
+      <w:r>
+        <w:t xml:space="preserve">on the right side.</w:t>
+      </w:r>
+    </w:p>
+    <w:p>
+      <w:pPr>
+        <w:numPr>
+          <w:ilvl w:val="0"/>
+          <w:numId w:val="1018"/>
+        </w:numPr>
+        <w:pStyle w:val="Compact"/>
+      </w:pPr>
+      <w:r>
+        <w:t xml:space="preserve">Confirm the deletion if a confirmation message appears.</w:t>
+      </w:r>
+    </w:p>
+    <w:p>
+      <w:pPr>
+        <w:pStyle w:val="BlockText"/>
+      </w:pPr>
+      <w:r>
+        <w:t xml:space="preserve">Caution: Deleted reports may not be recoverable. Confirm that the correct report is selected before deleting it.</w:t>
+      </w:r>
+    </w:p>
+    <w:bookmarkEnd w:id="51"/>
+    <w:bookmarkStart w:id="52" w:name="export-reports-to-usb-flash-disk"/>
+    <w:p>
+      <w:pPr>
+        <w:pStyle w:val="Heading3"/>
+      </w:pPr>
+      <w:r>
+        <w:t xml:space="preserve">7.8 Export Reports to USB Flash Disk</w:t>
+      </w:r>
+    </w:p>
+    <w:p>
+      <w:pPr>
+        <w:pStyle w:val="FirstParagraph"/>
+      </w:pPr>
+      <w:r>
+        <w:t xml:space="preserve">The</w:t>
+      </w:r>
+      <w:r>
+        <w:t xml:space="preserve"> </w:t>
+      </w:r>
+      <w:r>
+        <w:rPr>
+          <w:bCs/>
+          <w:b/>
+        </w:rPr>
+        <w:t xml:space="preserve">Export</w:t>
+      </w:r>
+      <w:r>
+        <w:t xml:space="preserve"> </w:t>
+      </w:r>
+      <w:r>
+        <w:t xml:space="preserve">function downloads saved report files to the USB flash disk supplied with the instrument.</w:t>
+      </w:r>
+    </w:p>
+    <w:p>
+      <w:pPr>
+        <w:pStyle w:val="BodyText"/>
+      </w:pPr>
+      <w:r>
+        <w:t xml:space="preserve">To export reports:</w:t>
+      </w:r>
+    </w:p>
+    <w:p>
+      <w:pPr>
+        <w:numPr>
+          <w:ilvl w:val="0"/>
+          <w:numId w:val="1019"/>
+        </w:numPr>
+      </w:pPr>
+      <w:r>
+        <w:t xml:space="preserve">Insert the USB flash disk supplied with the instrument into a USB port on the back of Nexus DX1.</w:t>
+      </w:r>
+    </w:p>
+    <w:p>
+      <w:pPr>
+        <w:numPr>
+          <w:ilvl w:val="0"/>
+          <w:numId w:val="1019"/>
+        </w:numPr>
+      </w:pPr>
+      <w:r>
+        <w:t xml:space="preserve">Tap</w:t>
+      </w:r>
+      <w:r>
+        <w:t xml:space="preserve"> </w:t>
+      </w:r>
+      <w:r>
+        <w:rPr>
+          <w:bCs/>
+          <w:b/>
+        </w:rPr>
+        <w:t xml:space="preserve">Reports</w:t>
+      </w:r>
+      <w:r>
+        <w:t xml:space="preserve"> </w:t>
+      </w:r>
+      <w:r>
+        <w:t xml:space="preserve">on the left navigation bar.</w:t>
+      </w:r>
+    </w:p>
+    <w:p>
+      <w:pPr>
+        <w:numPr>
+          <w:ilvl w:val="0"/>
+          <w:numId w:val="1019"/>
+        </w:numPr>
+      </w:pPr>
+      <w:r>
+        <w:t xml:space="preserve">Tap</w:t>
+      </w:r>
+      <w:r>
+        <w:t xml:space="preserve"> </w:t>
+      </w:r>
+      <w:r>
+        <w:rPr>
+          <w:bCs/>
+          <w:b/>
+        </w:rPr>
+        <w:t xml:space="preserve">Export</w:t>
+      </w:r>
+      <w:r>
+        <w:t xml:space="preserve"> </w:t>
+      </w:r>
+      <w:r>
+        <w:t xml:space="preserve">on the right side.</w:t>
+      </w:r>
+    </w:p>
+    <w:p>
+      <w:pPr>
+        <w:numPr>
+          <w:ilvl w:val="0"/>
+          <w:numId w:val="1019"/>
+        </w:numPr>
+      </w:pPr>
+      <w:r>
+        <w:t xml:space="preserve">When the password prompt appears, enter:</w:t>
+      </w:r>
+    </w:p>
+    <w:p>
+      <w:pPr>
+        <w:numPr>
+          <w:ilvl w:val="0"/>
+          <w:numId w:val="1000"/>
+        </w:numPr>
+      </w:pPr>
+      <w:r>
+        <w:rPr>
+          <w:bCs/>
+          <w:b/>
+        </w:rPr>
+        <w:t xml:space="preserve">000000</w:t>
+      </w:r>
+    </w:p>
+    <w:p>
+      <w:pPr>
+        <w:numPr>
+          <w:ilvl w:val="0"/>
+          <w:numId w:val="1019"/>
+        </w:numPr>
+      </w:pPr>
+      <w:r>
+        <w:t xml:space="preserve">Confirm the export operation.</w:t>
+      </w:r>
+    </w:p>
+    <w:p>
+      <w:pPr>
+        <w:numPr>
+          <w:ilvl w:val="0"/>
+          <w:numId w:val="1019"/>
+        </w:numPr>
+      </w:pPr>
+      <w:r>
+        <w:t xml:space="preserve">Wait until the system finishes downloading the report files to the USB flash disk.</w:t>
+      </w:r>
+    </w:p>
+    <w:p>
+      <w:pPr>
+        <w:numPr>
+          <w:ilvl w:val="0"/>
+          <w:numId w:val="1019"/>
+        </w:numPr>
+      </w:pPr>
+      <w:r>
+        <w:t xml:space="preserve">Remove the USB flash disk only after the export is completed.</w:t>
+      </w:r>
+    </w:p>
+    <w:p>
+      <w:pPr>
+        <w:pStyle w:val="BlockText"/>
+      </w:pPr>
+      <w:r>
+        <w:t xml:space="preserve">Note: Use the USB flash disk supplied with the instrument when exporting reports. Do not remove the USB flash disk during export.</w:t>
+      </w:r>
+    </w:p>
+    <w:bookmarkEnd w:id="52"/>
+    <w:bookmarkStart w:id="53" w:name="recommended-operating-notes-1"/>
+    <w:p>
+      <w:pPr>
+        <w:pStyle w:val="Heading3"/>
+      </w:pPr>
+      <w:r>
+        <w:t xml:space="preserve">7.9 Recommended Operating Notes</w:t>
+      </w:r>
+    </w:p>
+    <w:p>
+      <w:pPr>
+        <w:numPr>
+          <w:ilvl w:val="0"/>
+          <w:numId w:val="1020"/>
+        </w:numPr>
+        <w:pStyle w:val="Compact"/>
+      </w:pPr>
+      <w:r>
+        <w:t xml:space="preserve">Use</w:t>
+      </w:r>
+      <w:r>
+        <w:t xml:space="preserve"> </w:t>
+      </w:r>
+      <w:r>
+        <w:rPr>
+          <w:bCs/>
+          <w:b/>
+        </w:rPr>
+        <w:t xml:space="preserve">Report List</w:t>
+      </w:r>
+      <w:r>
+        <w:t xml:space="preserve"> </w:t>
+      </w:r>
+      <w:r>
+        <w:t xml:space="preserve">to locate saved test results.</w:t>
+      </w:r>
+    </w:p>
+    <w:p>
+      <w:pPr>
+        <w:numPr>
+          <w:ilvl w:val="0"/>
+          <w:numId w:val="1020"/>
+        </w:numPr>
+        <w:pStyle w:val="Compact"/>
+      </w:pPr>
+      <w:r>
+        <w:t xml:space="preserve">Select the correct row before tapping</w:t>
+      </w:r>
+      <w:r>
+        <w:t xml:space="preserve"> </w:t>
+      </w:r>
+      <w:r>
+        <w:rPr>
+          <w:bCs/>
+          <w:b/>
+        </w:rPr>
+        <w:t xml:space="preserve">Full Report</w:t>
+      </w:r>
+      <w:r>
+        <w:t xml:space="preserve">,</w:t>
+      </w:r>
+      <w:r>
+        <w:t xml:space="preserve"> </w:t>
+      </w:r>
+      <w:r>
+        <w:rPr>
+          <w:bCs/>
+          <w:b/>
+        </w:rPr>
+        <w:t xml:space="preserve">Delete</w:t>
+      </w:r>
+      <w:r>
+        <w:t xml:space="preserve">, or</w:t>
+      </w:r>
+      <w:r>
+        <w:t xml:space="preserve"> </w:t>
+      </w:r>
+      <w:r>
+        <w:rPr>
+          <w:bCs/>
+          <w:b/>
+        </w:rPr>
+        <w:t xml:space="preserve">Video Playback</w:t>
+      </w:r>
+      <w:r>
+        <w:t xml:space="preserve">.</w:t>
+      </w:r>
+    </w:p>
+    <w:p>
+      <w:pPr>
+        <w:numPr>
+          <w:ilvl w:val="0"/>
+          <w:numId w:val="1020"/>
+        </w:numPr>
+        <w:pStyle w:val="Compact"/>
+      </w:pPr>
+      <w:r>
+        <w:t xml:space="preserve">Use</w:t>
+      </w:r>
+      <w:r>
+        <w:t xml:space="preserve"> </w:t>
+      </w:r>
+      <w:r>
+        <w:rPr>
+          <w:bCs/>
+          <w:b/>
+        </w:rPr>
+        <w:t xml:space="preserve">Digital Results</w:t>
+      </w:r>
+      <w:r>
+        <w:t xml:space="preserve"> </w:t>
+      </w:r>
+      <w:r>
+        <w:t xml:space="preserve">to review numerical result data.</w:t>
+      </w:r>
+    </w:p>
+    <w:p>
+      <w:pPr>
+        <w:numPr>
+          <w:ilvl w:val="0"/>
+          <w:numId w:val="1020"/>
+        </w:numPr>
+        <w:pStyle w:val="Compact"/>
+      </w:pPr>
+      <w:r>
+        <w:t xml:space="preserve">Use</w:t>
+      </w:r>
+      <w:r>
+        <w:t xml:space="preserve"> </w:t>
+      </w:r>
+      <w:r>
+        <w:rPr>
+          <w:bCs/>
+          <w:b/>
+        </w:rPr>
+        <w:t xml:space="preserve">Video Playback</w:t>
+      </w:r>
+      <w:r>
+        <w:t xml:space="preserve"> </w:t>
+      </w:r>
+      <w:r>
+        <w:t xml:space="preserve">to review the recorded microscopic video.</w:t>
+      </w:r>
+    </w:p>
+    <w:p>
+      <w:pPr>
+        <w:numPr>
+          <w:ilvl w:val="0"/>
+          <w:numId w:val="1020"/>
+        </w:numPr>
+        <w:pStyle w:val="Compact"/>
+      </w:pPr>
+      <w:r>
+        <w:t xml:space="preserve">Insert the supplied USB flash disk before using</w:t>
+      </w:r>
+      <w:r>
+        <w:t xml:space="preserve"> </w:t>
+      </w:r>
+      <w:r>
+        <w:rPr>
+          <w:bCs/>
+          <w:b/>
+        </w:rPr>
+        <w:t xml:space="preserve">Export</w:t>
+      </w:r>
+      <w:r>
+        <w:t xml:space="preserve">.</w:t>
+      </w:r>
+    </w:p>
+    <w:p>
+      <w:pPr>
+        <w:numPr>
+          <w:ilvl w:val="0"/>
+          <w:numId w:val="1020"/>
+        </w:numPr>
+        <w:pStyle w:val="Compact"/>
+      </w:pPr>
+      <w:r>
+        <w:t xml:space="preserve">Enter password</w:t>
+      </w:r>
+      <w:r>
+        <w:t xml:space="preserve"> </w:t>
+      </w:r>
+      <w:r>
+        <w:rPr>
+          <w:bCs/>
+          <w:b/>
+        </w:rPr>
+        <w:t xml:space="preserve">000000</w:t>
+      </w:r>
+      <w:r>
+        <w:t xml:space="preserve"> </w:t>
+      </w:r>
+      <w:r>
+        <w:t xml:space="preserve">when prompted during export.</w:t>
+      </w:r>
+    </w:p>
+    <w:p>
+      <w:pPr>
+        <w:numPr>
+          <w:ilvl w:val="0"/>
+          <w:numId w:val="1020"/>
+        </w:numPr>
+        <w:pStyle w:val="Compact"/>
+      </w:pPr>
+      <w:r>
+        <w:t xml:space="preserve">Confirm that export is completed before removing the USB flash disk.</w:t>
+      </w:r>
+    </w:p>
+    <w:bookmarkEnd w:id="53"/>
+    <w:bookmarkStart w:id="54" w:name="troubleshooting-1"/>
+    <w:p>
+      <w:pPr>
+        <w:pStyle w:val="Heading3"/>
+      </w:pPr>
+      <w:r>
+        <w:t xml:space="preserve">7.10 Troubleshooting</w:t>
+      </w:r>
+    </w:p>
+    <w:tbl>
+      <w:tblPr>
+        <w:tblStyle w:val="Table"/>
+        <w:tblW w:type="pct" w:w="5000"/>
+        <w:tblLook w:firstRow="1" w:lastRow="0" w:firstColumn="0" w:lastColumn="0" w:noHBand="0" w:noVBand="0" w:val="0020"/>
+        <w:jc w:val="start"/>
+      </w:tblPr>
+      <w:tblGrid>
+        <w:gridCol w:w="2640"/>
+        <w:gridCol w:w="2640"/>
+        <w:gridCol w:w="2640"/>
+      </w:tblGrid>
+      <w:tr>
+        <w:trPr>
+          <w:tblHeader w:val="true"/>
+        </w:trPr>
+        <w:tc>
+          <w:tcPr/>
+          <w:p>
+            <w:pPr>
+              <w:pStyle w:val="Compact"/>
+              <w:jc w:val="left"/>
+            </w:pPr>
+            <w:r>
+              <w:t xml:space="preserve">Situation</w:t>
+            </w:r>
+          </w:p>
+        </w:tc>
+        <w:tc>
+          <w:tcPr/>
+          <w:p>
+            <w:pPr>
+              <w:pStyle w:val="Compact"/>
+              <w:jc w:val="left"/>
+            </w:pPr>
+            <w:r>
+              <w:t xml:space="preserve">Possible Cause</w:t>
+            </w:r>
+          </w:p>
+        </w:tc>
+        <w:tc>
+          <w:tcPr/>
+          <w:p>
+            <w:pPr>
+              <w:pStyle w:val="Compact"/>
+              <w:jc w:val="left"/>
+            </w:pPr>
+            <w:r>
+              <w:t xml:space="preserve">Recommended Action</w:t>
+            </w:r>
+          </w:p>
+        </w:tc>
+      </w:tr>
+      <w:tr>
+        <w:tc>
+          <w:tcPr/>
+          <w:p>
+            <w:pPr>
+              <w:pStyle w:val="Compact"/>
+              <w:jc w:val="left"/>
+            </w:pPr>
+            <w:r>
+              <w:t xml:space="preserve">The expected report is not visible in the list.</w:t>
+            </w:r>
+          </w:p>
+        </w:tc>
+        <w:tc>
+          <w:tcPr/>
+          <w:p>
+            <w:pPr>
+              <w:pStyle w:val="Compact"/>
+              <w:jc w:val="left"/>
+            </w:pPr>
+            <w:r>
+              <w:t xml:space="preserve">The result may be listed under its automatically assigned reference number or another test time.</w:t>
+            </w:r>
+          </w:p>
+        </w:tc>
+        <w:tc>
+          <w:tcPr/>
+          <w:p>
+            <w:pPr>
+              <w:pStyle w:val="Compact"/>
+              <w:jc w:val="left"/>
+            </w:pPr>
+            <w:r>
+              <w:t xml:space="preserve">Check the</w:t>
+            </w:r>
+            <w:r>
+              <w:t xml:space="preserve"> </w:t>
+            </w:r>
+            <w:r>
+              <w:rPr>
+                <w:bCs/>
+                <w:b/>
+              </w:rPr>
+              <w:t xml:space="preserve">Ref.</w:t>
+            </w:r>
+            <w:r>
+              <w:t xml:space="preserve">,</w:t>
+            </w:r>
+            <w:r>
+              <w:t xml:space="preserve"> </w:t>
+            </w:r>
+            <w:r>
+              <w:rPr>
+                <w:bCs/>
+                <w:b/>
+              </w:rPr>
+              <w:t xml:space="preserve">Date</w:t>
+            </w:r>
+            <w:r>
+              <w:t xml:space="preserve">, and</w:t>
+            </w:r>
+            <w:r>
+              <w:t xml:space="preserve"> </w:t>
+            </w:r>
+            <w:r>
+              <w:rPr>
+                <w:bCs/>
+                <w:b/>
+              </w:rPr>
+              <w:t xml:space="preserve">Time</w:t>
+            </w:r>
+            <w:r>
+              <w:t xml:space="preserve"> </w:t>
+            </w:r>
+            <w:r>
+              <w:t xml:space="preserve">columns.</w:t>
+            </w:r>
+          </w:p>
+        </w:tc>
+      </w:tr>
+      <w:tr>
+        <w:tc>
+          <w:tcPr/>
+          <w:p>
+            <w:pPr>
+              <w:pStyle w:val="Compact"/>
+              <w:jc w:val="left"/>
+            </w:pPr>
+            <w:r>
+              <w:t xml:space="preserve">Full Report does not open.</w:t>
+            </w:r>
+          </w:p>
+        </w:tc>
+        <w:tc>
+          <w:tcPr/>
+          <w:p>
+            <w:pPr>
+              <w:pStyle w:val="Compact"/>
+              <w:jc w:val="left"/>
+            </w:pPr>
+            <w:r>
+              <w:t xml:space="preserve">No report row is selected.</w:t>
+            </w:r>
+          </w:p>
+        </w:tc>
+        <w:tc>
+          <w:tcPr/>
+          <w:p>
+            <w:pPr>
+              <w:pStyle w:val="Compact"/>
+              <w:jc w:val="left"/>
+            </w:pPr>
+            <w:r>
+              <w:t xml:space="preserve">Select one report row, then tap</w:t>
+            </w:r>
+            <w:r>
+              <w:t xml:space="preserve"> </w:t>
+            </w:r>
+            <w:r>
+              <w:rPr>
+                <w:bCs/>
+                <w:b/>
+              </w:rPr>
+              <w:t xml:space="preserve">Full Report</w:t>
+            </w:r>
+            <w:r>
+              <w:t xml:space="preserve"> </w:t>
+            </w:r>
+            <w:r>
+              <w:t xml:space="preserve">again.</w:t>
+            </w:r>
+          </w:p>
+        </w:tc>
+      </w:tr>
+      <w:tr>
+        <w:tc>
+          <w:tcPr/>
+          <w:p>
+            <w:pPr>
+              <w:pStyle w:val="Compact"/>
+              <w:jc w:val="left"/>
+            </w:pPr>
+            <w:r>
+              <w:t xml:space="preserve">The wrong report was opened.</w:t>
+            </w:r>
+          </w:p>
+        </w:tc>
+        <w:tc>
+          <w:tcPr/>
+          <w:p>
+            <w:pPr>
+              <w:pStyle w:val="Compact"/>
+              <w:jc w:val="left"/>
+            </w:pPr>
+            <w:r>
+              <w:t xml:space="preserve">A different row was selected in the report list.</w:t>
+            </w:r>
+          </w:p>
+        </w:tc>
+        <w:tc>
+          <w:tcPr/>
+          <w:p>
+            <w:pPr>
+              <w:pStyle w:val="Compact"/>
+              <w:jc w:val="left"/>
+            </w:pPr>
+            <w:r>
+              <w:t xml:space="preserve">Return to</w:t>
+            </w:r>
+            <w:r>
+              <w:t xml:space="preserve"> </w:t>
+            </w:r>
+            <w:r>
+              <w:rPr>
+                <w:bCs/>
+                <w:b/>
+              </w:rPr>
+              <w:t xml:space="preserve">Report List</w:t>
+            </w:r>
+            <w:r>
+              <w:t xml:space="preserve">, select the correct row, and tap</w:t>
+            </w:r>
+            <w:r>
+              <w:t xml:space="preserve"> </w:t>
+            </w:r>
+            <w:r>
+              <w:rPr>
+                <w:bCs/>
+                <w:b/>
+              </w:rPr>
+              <w:t xml:space="preserve">Full Report</w:t>
+            </w:r>
+            <w:r>
+              <w:t xml:space="preserve">.</w:t>
+            </w:r>
+          </w:p>
+        </w:tc>
+      </w:tr>
+      <w:tr>
+        <w:tc>
+          <w:tcPr/>
+          <w:p>
+            <w:pPr>
+              <w:pStyle w:val="Compact"/>
+              <w:jc w:val="left"/>
+            </w:pPr>
+            <w:r>
+              <w:t xml:space="preserve">Video playback is not shown.</w:t>
+            </w:r>
+          </w:p>
+        </w:tc>
+        <w:tc>
+          <w:tcPr/>
+          <w:p>
+            <w:pPr>
+              <w:pStyle w:val="Compact"/>
+              <w:jc w:val="left"/>
+            </w:pPr>
+            <w:r>
+              <w:t xml:space="preserve">The operator is still in Digital Results view.</w:t>
+            </w:r>
+          </w:p>
+        </w:tc>
+        <w:tc>
+          <w:tcPr/>
+          <w:p>
+            <w:pPr>
+              <w:pStyle w:val="Compact"/>
+              <w:jc w:val="left"/>
+            </w:pPr>
+            <w:r>
+              <w:t xml:space="preserve">Tap</w:t>
+            </w:r>
+            <w:r>
+              <w:t xml:space="preserve"> </w:t>
+            </w:r>
+            <w:r>
+              <w:rPr>
+                <w:bCs/>
+                <w:b/>
+              </w:rPr>
+              <w:t xml:space="preserve">Video Playback</w:t>
+            </w:r>
+            <w:r>
+              <w:t xml:space="preserve"> </w:t>
+            </w:r>
+            <w:r>
+              <w:t xml:space="preserve">at the top of the screen.</w:t>
+            </w:r>
+          </w:p>
+        </w:tc>
+      </w:tr>
+      <w:tr>
+        <w:tc>
+          <w:tcPr/>
+          <w:p>
+            <w:pPr>
+              <w:pStyle w:val="Compact"/>
+              <w:jc w:val="left"/>
+            </w:pPr>
+            <w:r>
+              <w:t xml:space="preserve">Export does not start.</w:t>
+            </w:r>
+          </w:p>
+        </w:tc>
+        <w:tc>
+          <w:tcPr/>
+          <w:p>
+            <w:pPr>
+              <w:pStyle w:val="Compact"/>
+              <w:jc w:val="left"/>
+            </w:pPr>
+            <w:r>
+              <w:t xml:space="preserve">USB flash disk is not inserted or not recognized.</w:t>
+            </w:r>
+          </w:p>
+        </w:tc>
+        <w:tc>
+          <w:tcPr/>
+          <w:p>
+            <w:pPr>
+              <w:pStyle w:val="Compact"/>
+              <w:jc w:val="left"/>
+            </w:pPr>
+            <w:r>
+              <w:t xml:space="preserve">Insert the supplied USB flash disk into the USB port on the back of the instrument, then try again.</w:t>
+            </w:r>
+          </w:p>
+        </w:tc>
+      </w:tr>
+      <w:tr>
+        <w:tc>
+          <w:tcPr/>
+          <w:p>
+            <w:pPr>
+              <w:pStyle w:val="Compact"/>
+              <w:jc w:val="left"/>
+            </w:pPr>
+            <w:r>
+              <w:t xml:space="preserve">Password is requested during export.</w:t>
+            </w:r>
+          </w:p>
+        </w:tc>
+        <w:tc>
+          <w:tcPr/>
+          <w:p>
+            <w:pPr>
+              <w:pStyle w:val="Compact"/>
+              <w:jc w:val="left"/>
+            </w:pPr>
+            <w:r>
+              <w:t xml:space="preserve">Export is password protected.</w:t>
+            </w:r>
+          </w:p>
+        </w:tc>
+        <w:tc>
+          <w:tcPr/>
+          <w:p>
+            <w:pPr>
+              <w:pStyle w:val="Compact"/>
+              <w:jc w:val="left"/>
+            </w:pPr>
+            <w:r>
+              <w:t xml:space="preserve">Enter</w:t>
+            </w:r>
+            <w:r>
+              <w:t xml:space="preserve"> </w:t>
+            </w:r>
+            <w:r>
+              <w:rPr>
+                <w:bCs/>
+                <w:b/>
+              </w:rPr>
+              <w:t xml:space="preserve">000000</w:t>
+            </w:r>
+            <w:r>
+              <w:t xml:space="preserve">.</w:t>
+            </w:r>
+          </w:p>
+        </w:tc>
+      </w:tr>
+    </w:tbl>
+    <w:bookmarkEnd w:id="54"/>
+    <w:bookmarkEnd w:id="55"/>
+    <w:bookmarkEnd w:id="56"/>
     <w:sectPr/>
   </w:body>
 </w:document>
@@ -2486,6 +4463,171 @@
     </w:lvlOverride>
   </w:num>
   <w:num w:numId="1010">
+    <w:abstractNumId w:val="991"/>
+  </w:num>
+  <w:num w:numId="1011">
+    <w:abstractNumId w:val="991"/>
+  </w:num>
+  <w:num w:numId="1012">
+    <w:abstractNumId w:val="991"/>
+  </w:num>
+  <w:num w:numId="1013">
+    <w:abstractNumId w:val="99411"/>
+    <w:lvlOverride w:ilvl="0">
+      <w:startOverride w:val="1"/>
+    </w:lvlOverride>
+    <w:lvlOverride w:ilvl="1">
+      <w:startOverride w:val="1"/>
+    </w:lvlOverride>
+    <w:lvlOverride w:ilvl="2">
+      <w:startOverride w:val="1"/>
+    </w:lvlOverride>
+    <w:lvlOverride w:ilvl="3">
+      <w:startOverride w:val="1"/>
+    </w:lvlOverride>
+    <w:lvlOverride w:ilvl="4">
+      <w:startOverride w:val="1"/>
+    </w:lvlOverride>
+    <w:lvlOverride w:ilvl="5">
+      <w:startOverride w:val="1"/>
+    </w:lvlOverride>
+    <w:lvlOverride w:ilvl="6">
+      <w:startOverride w:val="1"/>
+    </w:lvlOverride>
+    <w:lvlOverride w:ilvl="7">
+      <w:startOverride w:val="1"/>
+    </w:lvlOverride>
+    <w:lvlOverride w:ilvl="8">
+      <w:startOverride w:val="1"/>
+    </w:lvlOverride>
+  </w:num>
+  <w:num w:numId="1014">
+    <w:abstractNumId w:val="991"/>
+  </w:num>
+  <w:num w:numId="1015">
+    <w:abstractNumId w:val="99411"/>
+    <w:lvlOverride w:ilvl="0">
+      <w:startOverride w:val="1"/>
+    </w:lvlOverride>
+    <w:lvlOverride w:ilvl="1">
+      <w:startOverride w:val="1"/>
+    </w:lvlOverride>
+    <w:lvlOverride w:ilvl="2">
+      <w:startOverride w:val="1"/>
+    </w:lvlOverride>
+    <w:lvlOverride w:ilvl="3">
+      <w:startOverride w:val="1"/>
+    </w:lvlOverride>
+    <w:lvlOverride w:ilvl="4">
+      <w:startOverride w:val="1"/>
+    </w:lvlOverride>
+    <w:lvlOverride w:ilvl="5">
+      <w:startOverride w:val="1"/>
+    </w:lvlOverride>
+    <w:lvlOverride w:ilvl="6">
+      <w:startOverride w:val="1"/>
+    </w:lvlOverride>
+    <w:lvlOverride w:ilvl="7">
+      <w:startOverride w:val="1"/>
+    </w:lvlOverride>
+    <w:lvlOverride w:ilvl="8">
+      <w:startOverride w:val="1"/>
+    </w:lvlOverride>
+  </w:num>
+  <w:num w:numId="1016">
+    <w:abstractNumId w:val="991"/>
+  </w:num>
+  <w:num w:numId="1017">
+    <w:abstractNumId w:val="99411"/>
+    <w:lvlOverride w:ilvl="0">
+      <w:startOverride w:val="1"/>
+    </w:lvlOverride>
+    <w:lvlOverride w:ilvl="1">
+      <w:startOverride w:val="1"/>
+    </w:lvlOverride>
+    <w:lvlOverride w:ilvl="2">
+      <w:startOverride w:val="1"/>
+    </w:lvlOverride>
+    <w:lvlOverride w:ilvl="3">
+      <w:startOverride w:val="1"/>
+    </w:lvlOverride>
+    <w:lvlOverride w:ilvl="4">
+      <w:startOverride w:val="1"/>
+    </w:lvlOverride>
+    <w:lvlOverride w:ilvl="5">
+      <w:startOverride w:val="1"/>
+    </w:lvlOverride>
+    <w:lvlOverride w:ilvl="6">
+      <w:startOverride w:val="1"/>
+    </w:lvlOverride>
+    <w:lvlOverride w:ilvl="7">
+      <w:startOverride w:val="1"/>
+    </w:lvlOverride>
+    <w:lvlOverride w:ilvl="8">
+      <w:startOverride w:val="1"/>
+    </w:lvlOverride>
+  </w:num>
+  <w:num w:numId="1018">
+    <w:abstractNumId w:val="99411"/>
+    <w:lvlOverride w:ilvl="0">
+      <w:startOverride w:val="1"/>
+    </w:lvlOverride>
+    <w:lvlOverride w:ilvl="1">
+      <w:startOverride w:val="1"/>
+    </w:lvlOverride>
+    <w:lvlOverride w:ilvl="2">
+      <w:startOverride w:val="1"/>
+    </w:lvlOverride>
+    <w:lvlOverride w:ilvl="3">
+      <w:startOverride w:val="1"/>
+    </w:lvlOverride>
+    <w:lvlOverride w:ilvl="4">
+      <w:startOverride w:val="1"/>
+    </w:lvlOverride>
+    <w:lvlOverride w:ilvl="5">
+      <w:startOverride w:val="1"/>
+    </w:lvlOverride>
+    <w:lvlOverride w:ilvl="6">
+      <w:startOverride w:val="1"/>
+    </w:lvlOverride>
+    <w:lvlOverride w:ilvl="7">
+      <w:startOverride w:val="1"/>
+    </w:lvlOverride>
+    <w:lvlOverride w:ilvl="8">
+      <w:startOverride w:val="1"/>
+    </w:lvlOverride>
+  </w:num>
+  <w:num w:numId="1019">
+    <w:abstractNumId w:val="99411"/>
+    <w:lvlOverride w:ilvl="0">
+      <w:startOverride w:val="1"/>
+    </w:lvlOverride>
+    <w:lvlOverride w:ilvl="1">
+      <w:startOverride w:val="1"/>
+    </w:lvlOverride>
+    <w:lvlOverride w:ilvl="2">
+      <w:startOverride w:val="1"/>
+    </w:lvlOverride>
+    <w:lvlOverride w:ilvl="3">
+      <w:startOverride w:val="1"/>
+    </w:lvlOverride>
+    <w:lvlOverride w:ilvl="4">
+      <w:startOverride w:val="1"/>
+    </w:lvlOverride>
+    <w:lvlOverride w:ilvl="5">
+      <w:startOverride w:val="1"/>
+    </w:lvlOverride>
+    <w:lvlOverride w:ilvl="6">
+      <w:startOverride w:val="1"/>
+    </w:lvlOverride>
+    <w:lvlOverride w:ilvl="7">
+      <w:startOverride w:val="1"/>
+    </w:lvlOverride>
+    <w:lvlOverride w:ilvl="8">
+      <w:startOverride w:val="1"/>
+    </w:lvlOverride>
+  </w:num>
+  <w:num w:numId="1020">
     <w:abstractNumId w:val="991"/>
   </w:num>
 </w:numbering>

</xml_diff>

<commit_message>
Add users workflow to Nexus DX1 app guide
Co-authored-by: benjaminzhuangbin <benjaminzhuangbin@users.noreply.github.com>
</commit_message>
<xml_diff>
--- a/docs/nexus-dx1/en/export/02-Instrument-APP-User-Guide.docx
+++ b/docs/nexus-dx1/en/export/02-Instrument-APP-User-Guide.docx
@@ -2,7 +2,7 @@
 <file path=word/document.xml><?xml version="1.0" encoding="utf-8"?>
 <w:document xmlns:w="http://schemas.openxmlformats.org/wordprocessingml/2006/main" xmlns:m="http://schemas.openxmlformats.org/officeDocument/2006/math" xmlns:r="http://schemas.openxmlformats.org/officeDocument/2006/relationships" xmlns:o="urn:schemas-microsoft-com:office:office" xmlns:v="urn:schemas-microsoft-com:vml" xmlns:w10="urn:schemas-microsoft-com:office:word" xmlns:a="http://schemas.openxmlformats.org/drawingml/2006/main" xmlns:pic="http://schemas.openxmlformats.org/drawingml/2006/picture" xmlns:wp="http://schemas.openxmlformats.org/drawingml/2006/wordprocessingDrawing">
   <w:body>
-    <w:bookmarkStart w:id="56" w:name="X112622d7f11cbc8aff1474781e7ce1fe98617de"/>
+    <w:bookmarkStart w:id="65" w:name="X112622d7f11cbc8aff1474781e7ce1fe98617de"/>
     <w:p>
       <w:pPr>
         <w:pStyle w:val="Heading1"/>
@@ -4083,7 +4083,1053 @@
     </w:tbl>
     <w:bookmarkEnd w:id="54"/>
     <w:bookmarkEnd w:id="55"/>
+    <w:bookmarkStart w:id="64" w:name="chapter-8.-users"/>
+    <w:p>
+      <w:pPr>
+        <w:pStyle w:val="Heading2"/>
+      </w:pPr>
+      <w:r>
+        <w:t xml:space="preserve">Chapter 8. Users</w:t>
+      </w:r>
+    </w:p>
+    <w:bookmarkStart w:id="56" w:name="overview-2"/>
+    <w:p>
+      <w:pPr>
+        <w:pStyle w:val="Heading3"/>
+      </w:pPr>
+      <w:r>
+        <w:t xml:space="preserve">8.1 Overview</w:t>
+      </w:r>
+    </w:p>
+    <w:p>
+      <w:pPr>
+        <w:pStyle w:val="FirstParagraph"/>
+      </w:pPr>
+      <w:r>
+        <w:t xml:space="preserve">The</w:t>
+      </w:r>
+      <w:r>
+        <w:t xml:space="preserve"> </w:t>
+      </w:r>
+      <w:r>
+        <w:rPr>
+          <w:bCs/>
+          <w:b/>
+        </w:rPr>
+        <w:t xml:space="preserve">Users</w:t>
+      </w:r>
+      <w:r>
+        <w:t xml:space="preserve"> </w:t>
+      </w:r>
+      <w:r>
+        <w:t xml:space="preserve">function is used to manage the instrument password and edit local instrument information. This information is stored and displayed on the instrument only.</w:t>
+      </w:r>
+    </w:p>
+    <w:p>
+      <w:pPr>
+        <w:pStyle w:val="BodyText"/>
+      </w:pPr>
+      <w:r>
+        <w:t xml:space="preserve">In the current software version, the information edited in this section is used for local reference and viewing only. It does not provide additional workflow, reporting, or remote management functions.</w:t>
+      </w:r>
+    </w:p>
     <w:bookmarkEnd w:id="56"/>
+    <w:bookmarkStart w:id="57" w:name="open-the-users-function"/>
+    <w:p>
+      <w:pPr>
+        <w:pStyle w:val="Heading3"/>
+      </w:pPr>
+      <w:r>
+        <w:t xml:space="preserve">8.2 Open the Users Function</w:t>
+      </w:r>
+    </w:p>
+    <w:p>
+      <w:pPr>
+        <w:numPr>
+          <w:ilvl w:val="0"/>
+          <w:numId w:val="1021"/>
+        </w:numPr>
+        <w:pStyle w:val="Compact"/>
+      </w:pPr>
+      <w:r>
+        <w:t xml:space="preserve">Tap</w:t>
+      </w:r>
+      <w:r>
+        <w:t xml:space="preserve"> </w:t>
+      </w:r>
+      <w:r>
+        <w:rPr>
+          <w:bCs/>
+          <w:b/>
+        </w:rPr>
+        <w:t xml:space="preserve">Users</w:t>
+      </w:r>
+      <w:r>
+        <w:t xml:space="preserve"> </w:t>
+      </w:r>
+      <w:r>
+        <w:t xml:space="preserve">on the left navigation bar.</w:t>
+      </w:r>
+    </w:p>
+    <w:p>
+      <w:pPr>
+        <w:numPr>
+          <w:ilvl w:val="0"/>
+          <w:numId w:val="1021"/>
+        </w:numPr>
+        <w:pStyle w:val="Compact"/>
+      </w:pPr>
+      <w:r>
+        <w:t xml:space="preserve">The system enters the</w:t>
+      </w:r>
+      <w:r>
+        <w:t xml:space="preserve"> </w:t>
+      </w:r>
+      <w:r>
+        <w:rPr>
+          <w:bCs/>
+          <w:b/>
+        </w:rPr>
+        <w:t xml:space="preserve">Password Management</w:t>
+      </w:r>
+      <w:r>
+        <w:t xml:space="preserve"> </w:t>
+      </w:r>
+      <w:r>
+        <w:t xml:space="preserve">screen.</w:t>
+      </w:r>
+    </w:p>
+    <w:p>
+      <w:pPr>
+        <w:numPr>
+          <w:ilvl w:val="0"/>
+          <w:numId w:val="1021"/>
+        </w:numPr>
+        <w:pStyle w:val="Compact"/>
+      </w:pPr>
+      <w:r>
+        <w:t xml:space="preserve">The right side of the screen displays brief notes for the current input area.</w:t>
+      </w:r>
+    </w:p>
+    <w:p>
+      <w:pPr>
+        <w:pStyle w:val="FirstParagraph"/>
+      </w:pPr>
+      <w:r>
+        <w:rPr>
+          <w:bCs/>
+          <w:b/>
+        </w:rPr>
+        <w:t xml:space="preserve">Figure 8-1. Users screen - Password Management</w:t>
+      </w:r>
+      <w:r>
+        <w:br/>
+      </w:r>
+      <w:r>
+        <w:rPr>
+          <w:iCs/>
+          <w:i/>
+        </w:rPr>
+        <w:t xml:space="preserve">[Insert screenshot: Users screen showing Password Management and local information tabs]</w:t>
+      </w:r>
+    </w:p>
+    <w:bookmarkEnd w:id="57"/>
+    <w:bookmarkStart w:id="58" w:name="password-management"/>
+    <w:p>
+      <w:pPr>
+        <w:pStyle w:val="Heading3"/>
+      </w:pPr>
+      <w:r>
+        <w:t xml:space="preserve">8.3 Password Management</w:t>
+      </w:r>
+    </w:p>
+    <w:p>
+      <w:pPr>
+        <w:pStyle w:val="FirstParagraph"/>
+      </w:pPr>
+      <w:r>
+        <w:t xml:space="preserve">The instrument password can be changed in the</w:t>
+      </w:r>
+      <w:r>
+        <w:t xml:space="preserve"> </w:t>
+      </w:r>
+      <w:r>
+        <w:rPr>
+          <w:bCs/>
+          <w:b/>
+        </w:rPr>
+        <w:t xml:space="preserve">Password Management</w:t>
+      </w:r>
+      <w:r>
+        <w:t xml:space="preserve"> </w:t>
+      </w:r>
+      <w:r>
+        <w:t xml:space="preserve">area.</w:t>
+      </w:r>
+    </w:p>
+    <w:p>
+      <w:pPr>
+        <w:pStyle w:val="BodyText"/>
+      </w:pPr>
+      <w:r>
+        <w:t xml:space="preserve">The default initial password is:</w:t>
+      </w:r>
+    </w:p>
+    <w:p>
+      <w:pPr>
+        <w:pStyle w:val="BodyText"/>
+      </w:pPr>
+      <w:r>
+        <w:rPr>
+          <w:bCs/>
+          <w:b/>
+        </w:rPr>
+        <w:t xml:space="preserve">000000</w:t>
+      </w:r>
+    </w:p>
+    <w:p>
+      <w:pPr>
+        <w:pStyle w:val="BodyText"/>
+      </w:pPr>
+      <w:r>
+        <w:t xml:space="preserve">To change the password:</w:t>
+      </w:r>
+    </w:p>
+    <w:p>
+      <w:pPr>
+        <w:numPr>
+          <w:ilvl w:val="0"/>
+          <w:numId w:val="1022"/>
+        </w:numPr>
+        <w:pStyle w:val="Compact"/>
+      </w:pPr>
+      <w:r>
+        <w:t xml:space="preserve">Tap</w:t>
+      </w:r>
+      <w:r>
+        <w:t xml:space="preserve"> </w:t>
+      </w:r>
+      <w:r>
+        <w:rPr>
+          <w:bCs/>
+          <w:b/>
+        </w:rPr>
+        <w:t xml:space="preserve">Users</w:t>
+      </w:r>
+      <w:r>
+        <w:t xml:space="preserve"> </w:t>
+      </w:r>
+      <w:r>
+        <w:t xml:space="preserve">on the left navigation bar.</w:t>
+      </w:r>
+    </w:p>
+    <w:p>
+      <w:pPr>
+        <w:numPr>
+          <w:ilvl w:val="0"/>
+          <w:numId w:val="1022"/>
+        </w:numPr>
+        <w:pStyle w:val="Compact"/>
+      </w:pPr>
+      <w:r>
+        <w:t xml:space="preserve">In the</w:t>
+      </w:r>
+      <w:r>
+        <w:t xml:space="preserve"> </w:t>
+      </w:r>
+      <w:r>
+        <w:rPr>
+          <w:bCs/>
+          <w:b/>
+        </w:rPr>
+        <w:t xml:space="preserve">Old password</w:t>
+      </w:r>
+      <w:r>
+        <w:t xml:space="preserve"> </w:t>
+      </w:r>
+      <w:r>
+        <w:t xml:space="preserve">field, enter the current password.</w:t>
+      </w:r>
+    </w:p>
+    <w:p>
+      <w:pPr>
+        <w:numPr>
+          <w:ilvl w:val="1"/>
+          <w:numId w:val="1023"/>
+        </w:numPr>
+        <w:pStyle w:val="Compact"/>
+      </w:pPr>
+      <w:r>
+        <w:t xml:space="preserve">For a new instrument or a password that has not been changed, enter</w:t>
+      </w:r>
+      <w:r>
+        <w:t xml:space="preserve"> </w:t>
+      </w:r>
+      <w:r>
+        <w:rPr>
+          <w:bCs/>
+          <w:b/>
+        </w:rPr>
+        <w:t xml:space="preserve">000000</w:t>
+      </w:r>
+      <w:r>
+        <w:t xml:space="preserve">.</w:t>
+      </w:r>
+    </w:p>
+    <w:p>
+      <w:pPr>
+        <w:numPr>
+          <w:ilvl w:val="0"/>
+          <w:numId w:val="1022"/>
+        </w:numPr>
+        <w:pStyle w:val="Compact"/>
+      </w:pPr>
+      <w:r>
+        <w:t xml:space="preserve">In the</w:t>
+      </w:r>
+      <w:r>
+        <w:t xml:space="preserve"> </w:t>
+      </w:r>
+      <w:r>
+        <w:rPr>
+          <w:bCs/>
+          <w:b/>
+        </w:rPr>
+        <w:t xml:space="preserve">New password</w:t>
+      </w:r>
+      <w:r>
+        <w:t xml:space="preserve"> </w:t>
+      </w:r>
+      <w:r>
+        <w:t xml:space="preserve">field, enter the new password.</w:t>
+      </w:r>
+    </w:p>
+    <w:p>
+      <w:pPr>
+        <w:numPr>
+          <w:ilvl w:val="0"/>
+          <w:numId w:val="1022"/>
+        </w:numPr>
+        <w:pStyle w:val="Compact"/>
+      </w:pPr>
+      <w:r>
+        <w:t xml:space="preserve">Tap</w:t>
+      </w:r>
+      <w:r>
+        <w:t xml:space="preserve"> </w:t>
+      </w:r>
+      <w:r>
+        <w:rPr>
+          <w:bCs/>
+          <w:b/>
+        </w:rPr>
+        <w:t xml:space="preserve">Confirm</w:t>
+      </w:r>
+      <w:r>
+        <w:t xml:space="preserve">.</w:t>
+      </w:r>
+    </w:p>
+    <w:p>
+      <w:pPr>
+        <w:numPr>
+          <w:ilvl w:val="0"/>
+          <w:numId w:val="1022"/>
+        </w:numPr>
+        <w:pStyle w:val="Compact"/>
+      </w:pPr>
+      <w:r>
+        <w:t xml:space="preserve">The system saves the new password.</w:t>
+      </w:r>
+    </w:p>
+    <w:p>
+      <w:pPr>
+        <w:pStyle w:val="FirstParagraph"/>
+      </w:pPr>
+      <w:r>
+        <w:t xml:space="preserve">The password must use digital numbers. The note on the right side of the screen indicates that the password should contain</w:t>
+      </w:r>
+      <w:r>
+        <w:t xml:space="preserve"> </w:t>
+      </w:r>
+      <w:r>
+        <w:rPr>
+          <w:bCs/>
+          <w:b/>
+        </w:rPr>
+        <w:t xml:space="preserve">6 to 15 digits</w:t>
+      </w:r>
+      <w:r>
+        <w:t xml:space="preserve">.</w:t>
+      </w:r>
+    </w:p>
+    <w:p>
+      <w:pPr>
+        <w:pStyle w:val="BlockText"/>
+      </w:pPr>
+      <w:r>
+        <w:t xml:space="preserve">Caution: Keep the new password in a safe place. If the password is changed and then lost, password recovery is not available from this function.</w:t>
+      </w:r>
+    </w:p>
+    <w:bookmarkEnd w:id="58"/>
+    <w:bookmarkStart w:id="59" w:name="local-information"/>
+    <w:p>
+      <w:pPr>
+        <w:pStyle w:val="Heading3"/>
+      </w:pPr>
+      <w:r>
+        <w:t xml:space="preserve">8.4 Local Information</w:t>
+      </w:r>
+    </w:p>
+    <w:p>
+      <w:pPr>
+        <w:pStyle w:val="FirstParagraph"/>
+      </w:pPr>
+      <w:r>
+        <w:t xml:space="preserve">The lower part of the Users screen allows the operator to edit four categories of local information:</w:t>
+      </w:r>
+    </w:p>
+    <w:p>
+      <w:pPr>
+        <w:numPr>
+          <w:ilvl w:val="0"/>
+          <w:numId w:val="1024"/>
+        </w:numPr>
+        <w:pStyle w:val="Compact"/>
+      </w:pPr>
+      <w:r>
+        <w:rPr>
+          <w:bCs/>
+          <w:b/>
+        </w:rPr>
+        <w:t xml:space="preserve">Company</w:t>
+      </w:r>
+    </w:p>
+    <w:p>
+      <w:pPr>
+        <w:numPr>
+          <w:ilvl w:val="0"/>
+          <w:numId w:val="1024"/>
+        </w:numPr>
+        <w:pStyle w:val="Compact"/>
+      </w:pPr>
+      <w:r>
+        <w:rPr>
+          <w:bCs/>
+          <w:b/>
+        </w:rPr>
+        <w:t xml:space="preserve">Center</w:t>
+      </w:r>
+    </w:p>
+    <w:p>
+      <w:pPr>
+        <w:numPr>
+          <w:ilvl w:val="0"/>
+          <w:numId w:val="1024"/>
+        </w:numPr>
+        <w:pStyle w:val="Compact"/>
+      </w:pPr>
+      <w:r>
+        <w:rPr>
+          <w:bCs/>
+          <w:b/>
+        </w:rPr>
+        <w:t xml:space="preserve">Laboratory</w:t>
+      </w:r>
+    </w:p>
+    <w:p>
+      <w:pPr>
+        <w:numPr>
+          <w:ilvl w:val="0"/>
+          <w:numId w:val="1024"/>
+        </w:numPr>
+        <w:pStyle w:val="Compact"/>
+      </w:pPr>
+      <w:r>
+        <w:rPr>
+          <w:bCs/>
+          <w:b/>
+        </w:rPr>
+        <w:t xml:space="preserve">Technician</w:t>
+      </w:r>
+    </w:p>
+    <w:p>
+      <w:pPr>
+        <w:pStyle w:val="FirstParagraph"/>
+      </w:pPr>
+      <w:r>
+        <w:t xml:space="preserve">Tap the corresponding tab to enter or select information.</w:t>
+      </w:r>
+    </w:p>
+    <w:p>
+      <w:pPr>
+        <w:pStyle w:val="BodyText"/>
+      </w:pPr>
+      <w:r>
+        <w:t xml:space="preserve">This information is used only for local instrument information storage and viewing. It currently has no additional function.</w:t>
+      </w:r>
+    </w:p>
+    <w:bookmarkEnd w:id="59"/>
+    <w:bookmarkStart w:id="60" w:name="edit-company-information"/>
+    <w:p>
+      <w:pPr>
+        <w:pStyle w:val="Heading3"/>
+      </w:pPr>
+      <w:r>
+        <w:t xml:space="preserve">8.5 Edit Company Information</w:t>
+      </w:r>
+    </w:p>
+    <w:p>
+      <w:pPr>
+        <w:numPr>
+          <w:ilvl w:val="0"/>
+          <w:numId w:val="1025"/>
+        </w:numPr>
+        <w:pStyle w:val="Compact"/>
+      </w:pPr>
+      <w:r>
+        <w:t xml:space="preserve">Tap</w:t>
+      </w:r>
+      <w:r>
+        <w:t xml:space="preserve"> </w:t>
+      </w:r>
+      <w:r>
+        <w:rPr>
+          <w:bCs/>
+          <w:b/>
+        </w:rPr>
+        <w:t xml:space="preserve">Users</w:t>
+      </w:r>
+      <w:r>
+        <w:t xml:space="preserve">.</w:t>
+      </w:r>
+    </w:p>
+    <w:p>
+      <w:pPr>
+        <w:numPr>
+          <w:ilvl w:val="0"/>
+          <w:numId w:val="1025"/>
+        </w:numPr>
+        <w:pStyle w:val="Compact"/>
+      </w:pPr>
+      <w:r>
+        <w:t xml:space="preserve">Tap</w:t>
+      </w:r>
+      <w:r>
+        <w:t xml:space="preserve"> </w:t>
+      </w:r>
+      <w:r>
+        <w:rPr>
+          <w:bCs/>
+          <w:b/>
+        </w:rPr>
+        <w:t xml:space="preserve">Company</w:t>
+      </w:r>
+      <w:r>
+        <w:t xml:space="preserve">.</w:t>
+      </w:r>
+    </w:p>
+    <w:p>
+      <w:pPr>
+        <w:numPr>
+          <w:ilvl w:val="0"/>
+          <w:numId w:val="1025"/>
+        </w:numPr>
+        <w:pStyle w:val="Compact"/>
+      </w:pPr>
+      <w:r>
+        <w:t xml:space="preserve">Enter or select the company title.</w:t>
+      </w:r>
+    </w:p>
+    <w:p>
+      <w:pPr>
+        <w:numPr>
+          <w:ilvl w:val="0"/>
+          <w:numId w:val="1025"/>
+        </w:numPr>
+        <w:pStyle w:val="Compact"/>
+      </w:pPr>
+      <w:r>
+        <w:t xml:space="preserve">Confirm or save the information according to the screen prompt.</w:t>
+      </w:r>
+    </w:p>
+    <w:p>
+      <w:pPr>
+        <w:pStyle w:val="FirstParagraph"/>
+      </w:pPr>
+      <w:r>
+        <w:t xml:space="preserve">The right-side note area displays brief guidance, such as:</w:t>
+      </w:r>
+    </w:p>
+    <w:p>
+      <w:pPr>
+        <w:pStyle w:val="BodyText"/>
+      </w:pPr>
+      <w:r>
+        <w:rPr>
+          <w:bCs/>
+          <w:b/>
+        </w:rPr>
+        <w:t xml:space="preserve">“</w:t>
+      </w:r>
+      <w:r>
+        <w:rPr>
+          <w:bCs/>
+          <w:b/>
+        </w:rPr>
+        <w:t xml:space="preserve">Enter or select Company Title</w:t>
+      </w:r>
+      <w:r>
+        <w:rPr>
+          <w:bCs/>
+          <w:b/>
+        </w:rPr>
+        <w:t xml:space="preserve">”</w:t>
+      </w:r>
+    </w:p>
+    <w:bookmarkEnd w:id="60"/>
+    <w:bookmarkStart w:id="61" w:name="Xbca740aac0aefab704ac75072ea5bb1f8525772"/>
+    <w:p>
+      <w:pPr>
+        <w:pStyle w:val="Heading3"/>
+      </w:pPr>
+      <w:r>
+        <w:t xml:space="preserve">8.6 Edit Center, Laboratory, and Technician Information</w:t>
+      </w:r>
+    </w:p>
+    <w:p>
+      <w:pPr>
+        <w:pStyle w:val="FirstParagraph"/>
+      </w:pPr>
+      <w:r>
+        <w:t xml:space="preserve">To edit other local information:</w:t>
+      </w:r>
+    </w:p>
+    <w:p>
+      <w:pPr>
+        <w:numPr>
+          <w:ilvl w:val="0"/>
+          <w:numId w:val="1026"/>
+        </w:numPr>
+        <w:pStyle w:val="Compact"/>
+      </w:pPr>
+      <w:r>
+        <w:t xml:space="preserve">Tap</w:t>
+      </w:r>
+      <w:r>
+        <w:t xml:space="preserve"> </w:t>
+      </w:r>
+      <w:r>
+        <w:rPr>
+          <w:bCs/>
+          <w:b/>
+        </w:rPr>
+        <w:t xml:space="preserve">Users</w:t>
+      </w:r>
+      <w:r>
+        <w:t xml:space="preserve">.</w:t>
+      </w:r>
+    </w:p>
+    <w:p>
+      <w:pPr>
+        <w:numPr>
+          <w:ilvl w:val="0"/>
+          <w:numId w:val="1026"/>
+        </w:numPr>
+        <w:pStyle w:val="Compact"/>
+      </w:pPr>
+      <w:r>
+        <w:t xml:space="preserve">Tap</w:t>
+      </w:r>
+      <w:r>
+        <w:t xml:space="preserve"> </w:t>
+      </w:r>
+      <w:r>
+        <w:rPr>
+          <w:bCs/>
+          <w:b/>
+        </w:rPr>
+        <w:t xml:space="preserve">Center</w:t>
+      </w:r>
+      <w:r>
+        <w:t xml:space="preserve">,</w:t>
+      </w:r>
+      <w:r>
+        <w:t xml:space="preserve"> </w:t>
+      </w:r>
+      <w:r>
+        <w:rPr>
+          <w:bCs/>
+          <w:b/>
+        </w:rPr>
+        <w:t xml:space="preserve">Laboratory</w:t>
+      </w:r>
+      <w:r>
+        <w:t xml:space="preserve">, or</w:t>
+      </w:r>
+      <w:r>
+        <w:t xml:space="preserve"> </w:t>
+      </w:r>
+      <w:r>
+        <w:rPr>
+          <w:bCs/>
+          <w:b/>
+        </w:rPr>
+        <w:t xml:space="preserve">Technician</w:t>
+      </w:r>
+      <w:r>
+        <w:t xml:space="preserve">.</w:t>
+      </w:r>
+    </w:p>
+    <w:p>
+      <w:pPr>
+        <w:numPr>
+          <w:ilvl w:val="0"/>
+          <w:numId w:val="1026"/>
+        </w:numPr>
+        <w:pStyle w:val="Compact"/>
+      </w:pPr>
+      <w:r>
+        <w:t xml:space="preserve">Enter or select the required information.</w:t>
+      </w:r>
+    </w:p>
+    <w:p>
+      <w:pPr>
+        <w:numPr>
+          <w:ilvl w:val="0"/>
+          <w:numId w:val="1026"/>
+        </w:numPr>
+        <w:pStyle w:val="Compact"/>
+      </w:pPr>
+      <w:r>
+        <w:t xml:space="preserve">Confirm or save the information according to the screen prompt.</w:t>
+      </w:r>
+    </w:p>
+    <w:p>
+      <w:pPr>
+        <w:pStyle w:val="FirstParagraph"/>
+      </w:pPr>
+      <w:r>
+        <w:t xml:space="preserve">The entered information is stored locally on the instrument.</w:t>
+      </w:r>
+    </w:p>
+    <w:bookmarkEnd w:id="61"/>
+    <w:bookmarkStart w:id="62" w:name="recommended-operating-notes-2"/>
+    <w:p>
+      <w:pPr>
+        <w:pStyle w:val="Heading3"/>
+      </w:pPr>
+      <w:r>
+        <w:t xml:space="preserve">8.7 Recommended Operating Notes</w:t>
+      </w:r>
+    </w:p>
+    <w:p>
+      <w:pPr>
+        <w:numPr>
+          <w:ilvl w:val="0"/>
+          <w:numId w:val="1027"/>
+        </w:numPr>
+        <w:pStyle w:val="Compact"/>
+      </w:pPr>
+      <w:r>
+        <w:t xml:space="preserve">The initial password is</w:t>
+      </w:r>
+      <w:r>
+        <w:t xml:space="preserve"> </w:t>
+      </w:r>
+      <w:r>
+        <w:rPr>
+          <w:bCs/>
+          <w:b/>
+        </w:rPr>
+        <w:t xml:space="preserve">000000</w:t>
+      </w:r>
+      <w:r>
+        <w:t xml:space="preserve">.</w:t>
+      </w:r>
+    </w:p>
+    <w:p>
+      <w:pPr>
+        <w:numPr>
+          <w:ilvl w:val="0"/>
+          <w:numId w:val="1027"/>
+        </w:numPr>
+        <w:pStyle w:val="Compact"/>
+      </w:pPr>
+      <w:r>
+        <w:t xml:space="preserve">Change the password only when required by the laboratory or distributor.</w:t>
+      </w:r>
+    </w:p>
+    <w:p>
+      <w:pPr>
+        <w:numPr>
+          <w:ilvl w:val="0"/>
+          <w:numId w:val="1027"/>
+        </w:numPr>
+        <w:pStyle w:val="Compact"/>
+      </w:pPr>
+      <w:r>
+        <w:t xml:space="preserve">Record the new password and keep it secure.</w:t>
+      </w:r>
+    </w:p>
+    <w:p>
+      <w:pPr>
+        <w:numPr>
+          <w:ilvl w:val="0"/>
+          <w:numId w:val="1027"/>
+        </w:numPr>
+        <w:pStyle w:val="Compact"/>
+      </w:pPr>
+      <w:r>
+        <w:t xml:space="preserve">Use a 6 to 15 digit numeric password.</w:t>
+      </w:r>
+    </w:p>
+    <w:p>
+      <w:pPr>
+        <w:numPr>
+          <w:ilvl w:val="0"/>
+          <w:numId w:val="1027"/>
+        </w:numPr>
+        <w:pStyle w:val="Compact"/>
+      </w:pPr>
+      <w:r>
+        <w:t xml:space="preserve">Local Company, Center, Laboratory, and Technician information is for instrument display and viewing only.</w:t>
+      </w:r>
+    </w:p>
+    <w:bookmarkEnd w:id="62"/>
+    <w:bookmarkStart w:id="63" w:name="troubleshooting-2"/>
+    <w:p>
+      <w:pPr>
+        <w:pStyle w:val="Heading3"/>
+      </w:pPr>
+      <w:r>
+        <w:t xml:space="preserve">8.8 Troubleshooting</w:t>
+      </w:r>
+    </w:p>
+    <w:tbl>
+      <w:tblPr>
+        <w:tblStyle w:val="Table"/>
+        <w:tblW w:type="pct" w:w="5000"/>
+        <w:tblLook w:firstRow="1" w:lastRow="0" w:firstColumn="0" w:lastColumn="0" w:noHBand="0" w:noVBand="0" w:val="0020"/>
+        <w:jc w:val="start"/>
+      </w:tblPr>
+      <w:tblGrid>
+        <w:gridCol w:w="2640"/>
+        <w:gridCol w:w="2640"/>
+        <w:gridCol w:w="2640"/>
+      </w:tblGrid>
+      <w:tr>
+        <w:trPr>
+          <w:tblHeader w:val="true"/>
+        </w:trPr>
+        <w:tc>
+          <w:tcPr/>
+          <w:p>
+            <w:pPr>
+              <w:pStyle w:val="Compact"/>
+              <w:jc w:val="left"/>
+            </w:pPr>
+            <w:r>
+              <w:t xml:space="preserve">Situation</w:t>
+            </w:r>
+          </w:p>
+        </w:tc>
+        <w:tc>
+          <w:tcPr/>
+          <w:p>
+            <w:pPr>
+              <w:pStyle w:val="Compact"/>
+              <w:jc w:val="left"/>
+            </w:pPr>
+            <w:r>
+              <w:t xml:space="preserve">Possible Cause</w:t>
+            </w:r>
+          </w:p>
+        </w:tc>
+        <w:tc>
+          <w:tcPr/>
+          <w:p>
+            <w:pPr>
+              <w:pStyle w:val="Compact"/>
+              <w:jc w:val="left"/>
+            </w:pPr>
+            <w:r>
+              <w:t xml:space="preserve">Recommended Action</w:t>
+            </w:r>
+          </w:p>
+        </w:tc>
+      </w:tr>
+      <w:tr>
+        <w:tc>
+          <w:tcPr/>
+          <w:p>
+            <w:pPr>
+              <w:pStyle w:val="Compact"/>
+              <w:jc w:val="left"/>
+            </w:pPr>
+            <w:r>
+              <w:t xml:space="preserve">The password cannot be changed.</w:t>
+            </w:r>
+          </w:p>
+        </w:tc>
+        <w:tc>
+          <w:tcPr/>
+          <w:p>
+            <w:pPr>
+              <w:pStyle w:val="Compact"/>
+              <w:jc w:val="left"/>
+            </w:pPr>
+            <w:r>
+              <w:t xml:space="preserve">The old password may be incorrect.</w:t>
+            </w:r>
+          </w:p>
+        </w:tc>
+        <w:tc>
+          <w:tcPr/>
+          <w:p>
+            <w:pPr>
+              <w:pStyle w:val="Compact"/>
+              <w:jc w:val="left"/>
+            </w:pPr>
+            <w:r>
+              <w:t xml:space="preserve">Enter the current password again. If the password has never been changed, enter</w:t>
+            </w:r>
+            <w:r>
+              <w:t xml:space="preserve"> </w:t>
+            </w:r>
+            <w:r>
+              <w:rPr>
+                <w:bCs/>
+                <w:b/>
+              </w:rPr>
+              <w:t xml:space="preserve">000000</w:t>
+            </w:r>
+            <w:r>
+              <w:t xml:space="preserve"> </w:t>
+            </w:r>
+            <w:r>
+              <w:t xml:space="preserve">as the old password.</w:t>
+            </w:r>
+          </w:p>
+        </w:tc>
+      </w:tr>
+      <w:tr>
+        <w:tc>
+          <w:tcPr/>
+          <w:p>
+            <w:pPr>
+              <w:pStyle w:val="Compact"/>
+              <w:jc w:val="left"/>
+            </w:pPr>
+            <w:r>
+              <w:t xml:space="preserve">The new password is not accepted.</w:t>
+            </w:r>
+          </w:p>
+        </w:tc>
+        <w:tc>
+          <w:tcPr/>
+          <w:p>
+            <w:pPr>
+              <w:pStyle w:val="Compact"/>
+              <w:jc w:val="left"/>
+            </w:pPr>
+            <w:r>
+              <w:t xml:space="preserve">The password format may be incorrect.</w:t>
+            </w:r>
+          </w:p>
+        </w:tc>
+        <w:tc>
+          <w:tcPr/>
+          <w:p>
+            <w:pPr>
+              <w:pStyle w:val="Compact"/>
+              <w:jc w:val="left"/>
+            </w:pPr>
+            <w:r>
+              <w:t xml:space="preserve">Use a numeric password with 6 to 15 digits.</w:t>
+            </w:r>
+          </w:p>
+        </w:tc>
+      </w:tr>
+      <w:tr>
+        <w:tc>
+          <w:tcPr/>
+          <w:p>
+            <w:pPr>
+              <w:pStyle w:val="Compact"/>
+              <w:jc w:val="left"/>
+            </w:pPr>
+            <w:r>
+              <w:t xml:space="preserve">The operator forgot the changed password.</w:t>
+            </w:r>
+          </w:p>
+        </w:tc>
+        <w:tc>
+          <w:tcPr/>
+          <w:p>
+            <w:pPr>
+              <w:pStyle w:val="Compact"/>
+              <w:jc w:val="left"/>
+            </w:pPr>
+            <w:r>
+              <w:t xml:space="preserve">The password was changed and not recorded.</w:t>
+            </w:r>
+          </w:p>
+        </w:tc>
+        <w:tc>
+          <w:tcPr/>
+          <w:p>
+            <w:pPr>
+              <w:pStyle w:val="Compact"/>
+              <w:jc w:val="left"/>
+            </w:pPr>
+            <w:r>
+              <w:t xml:space="preserve">Contact the distributor or service provider. Password recovery is not available from this function.</w:t>
+            </w:r>
+          </w:p>
+        </w:tc>
+      </w:tr>
+      <w:tr>
+        <w:tc>
+          <w:tcPr/>
+          <w:p>
+            <w:pPr>
+              <w:pStyle w:val="Compact"/>
+              <w:jc w:val="left"/>
+            </w:pPr>
+            <w:r>
+              <w:t xml:space="preserve">Local information has no visible effect on analysis.</w:t>
+            </w:r>
+          </w:p>
+        </w:tc>
+        <w:tc>
+          <w:tcPr/>
+          <w:p>
+            <w:pPr>
+              <w:pStyle w:val="Compact"/>
+              <w:jc w:val="left"/>
+            </w:pPr>
+            <w:r>
+              <w:t xml:space="preserve">The information is for local storage and viewing only.</w:t>
+            </w:r>
+          </w:p>
+        </w:tc>
+        <w:tc>
+          <w:tcPr/>
+          <w:p>
+            <w:pPr>
+              <w:pStyle w:val="Compact"/>
+              <w:jc w:val="left"/>
+            </w:pPr>
+            <w:r>
+              <w:t xml:space="preserve">Use this section only for local instrument information management.</w:t>
+            </w:r>
+          </w:p>
+        </w:tc>
+      </w:tr>
+    </w:tbl>
+    <w:bookmarkEnd w:id="63"/>
+    <w:bookmarkEnd w:id="64"/>
+    <w:bookmarkEnd w:id="65"/>
     <w:sectPr/>
   </w:body>
 </w:document>
@@ -4628,6 +5674,135 @@
     </w:lvlOverride>
   </w:num>
   <w:num w:numId="1020">
+    <w:abstractNumId w:val="991"/>
+  </w:num>
+  <w:num w:numId="1021">
+    <w:abstractNumId w:val="99411"/>
+    <w:lvlOverride w:ilvl="0">
+      <w:startOverride w:val="1"/>
+    </w:lvlOverride>
+    <w:lvlOverride w:ilvl="1">
+      <w:startOverride w:val="1"/>
+    </w:lvlOverride>
+    <w:lvlOverride w:ilvl="2">
+      <w:startOverride w:val="1"/>
+    </w:lvlOverride>
+    <w:lvlOverride w:ilvl="3">
+      <w:startOverride w:val="1"/>
+    </w:lvlOverride>
+    <w:lvlOverride w:ilvl="4">
+      <w:startOverride w:val="1"/>
+    </w:lvlOverride>
+    <w:lvlOverride w:ilvl="5">
+      <w:startOverride w:val="1"/>
+    </w:lvlOverride>
+    <w:lvlOverride w:ilvl="6">
+      <w:startOverride w:val="1"/>
+    </w:lvlOverride>
+    <w:lvlOverride w:ilvl="7">
+      <w:startOverride w:val="1"/>
+    </w:lvlOverride>
+    <w:lvlOverride w:ilvl="8">
+      <w:startOverride w:val="1"/>
+    </w:lvlOverride>
+  </w:num>
+  <w:num w:numId="1022">
+    <w:abstractNumId w:val="99411"/>
+    <w:lvlOverride w:ilvl="0">
+      <w:startOverride w:val="1"/>
+    </w:lvlOverride>
+    <w:lvlOverride w:ilvl="1">
+      <w:startOverride w:val="1"/>
+    </w:lvlOverride>
+    <w:lvlOverride w:ilvl="2">
+      <w:startOverride w:val="1"/>
+    </w:lvlOverride>
+    <w:lvlOverride w:ilvl="3">
+      <w:startOverride w:val="1"/>
+    </w:lvlOverride>
+    <w:lvlOverride w:ilvl="4">
+      <w:startOverride w:val="1"/>
+    </w:lvlOverride>
+    <w:lvlOverride w:ilvl="5">
+      <w:startOverride w:val="1"/>
+    </w:lvlOverride>
+    <w:lvlOverride w:ilvl="6">
+      <w:startOverride w:val="1"/>
+    </w:lvlOverride>
+    <w:lvlOverride w:ilvl="7">
+      <w:startOverride w:val="1"/>
+    </w:lvlOverride>
+    <w:lvlOverride w:ilvl="8">
+      <w:startOverride w:val="1"/>
+    </w:lvlOverride>
+  </w:num>
+  <w:num w:numId="1023">
+    <w:abstractNumId w:val="991"/>
+  </w:num>
+  <w:num w:numId="1024">
+    <w:abstractNumId w:val="991"/>
+  </w:num>
+  <w:num w:numId="1025">
+    <w:abstractNumId w:val="99411"/>
+    <w:lvlOverride w:ilvl="0">
+      <w:startOverride w:val="1"/>
+    </w:lvlOverride>
+    <w:lvlOverride w:ilvl="1">
+      <w:startOverride w:val="1"/>
+    </w:lvlOverride>
+    <w:lvlOverride w:ilvl="2">
+      <w:startOverride w:val="1"/>
+    </w:lvlOverride>
+    <w:lvlOverride w:ilvl="3">
+      <w:startOverride w:val="1"/>
+    </w:lvlOverride>
+    <w:lvlOverride w:ilvl="4">
+      <w:startOverride w:val="1"/>
+    </w:lvlOverride>
+    <w:lvlOverride w:ilvl="5">
+      <w:startOverride w:val="1"/>
+    </w:lvlOverride>
+    <w:lvlOverride w:ilvl="6">
+      <w:startOverride w:val="1"/>
+    </w:lvlOverride>
+    <w:lvlOverride w:ilvl="7">
+      <w:startOverride w:val="1"/>
+    </w:lvlOverride>
+    <w:lvlOverride w:ilvl="8">
+      <w:startOverride w:val="1"/>
+    </w:lvlOverride>
+  </w:num>
+  <w:num w:numId="1026">
+    <w:abstractNumId w:val="99411"/>
+    <w:lvlOverride w:ilvl="0">
+      <w:startOverride w:val="1"/>
+    </w:lvlOverride>
+    <w:lvlOverride w:ilvl="1">
+      <w:startOverride w:val="1"/>
+    </w:lvlOverride>
+    <w:lvlOverride w:ilvl="2">
+      <w:startOverride w:val="1"/>
+    </w:lvlOverride>
+    <w:lvlOverride w:ilvl="3">
+      <w:startOverride w:val="1"/>
+    </w:lvlOverride>
+    <w:lvlOverride w:ilvl="4">
+      <w:startOverride w:val="1"/>
+    </w:lvlOverride>
+    <w:lvlOverride w:ilvl="5">
+      <w:startOverride w:val="1"/>
+    </w:lvlOverride>
+    <w:lvlOverride w:ilvl="6">
+      <w:startOverride w:val="1"/>
+    </w:lvlOverride>
+    <w:lvlOverride w:ilvl="7">
+      <w:startOverride w:val="1"/>
+    </w:lvlOverride>
+    <w:lvlOverride w:ilvl="8">
+      <w:startOverride w:val="1"/>
+    </w:lvlOverride>
+  </w:num>
+  <w:num w:numId="1027">
     <w:abstractNumId w:val="991"/>
   </w:num>
 </w:numbering>

</xml_diff>

<commit_message>
Refine manuals after PDF review
Co-authored-by: benjaminzhuangbin <benjaminzhuangbin@users.noreply.github.com>
</commit_message>
<xml_diff>
--- a/docs/nexus-dx1/en/export/02-Instrument-APP-User-Guide.docx
+++ b/docs/nexus-dx1/en/export/02-Instrument-APP-User-Guide.docx
@@ -909,7 +909,127 @@
     </w:p>
     <w:p>
       <w:pPr>
+        <w:numPr>
+          <w:ilvl w:val="0"/>
+          <w:numId w:val="1004"/>
+        </w:numPr>
+        <w:pStyle w:val="Compact"/>
+      </w:pPr>
+      <w:r>
+        <w:rPr>
+          <w:bCs/>
+          <w:b/>
+        </w:rPr>
+        <w:t xml:space="preserve">Liquefaction time</w:t>
+      </w:r>
+    </w:p>
+    <w:p>
+      <w:pPr>
+        <w:numPr>
+          <w:ilvl w:val="0"/>
+          <w:numId w:val="1004"/>
+        </w:numPr>
+        <w:pStyle w:val="Compact"/>
+      </w:pPr>
+      <w:r>
+        <w:rPr>
+          <w:bCs/>
+          <w:b/>
+        </w:rPr>
+        <w:t xml:space="preserve">Liquefaction treatment</w:t>
+      </w:r>
+    </w:p>
+    <w:p>
+      <w:pPr>
+        <w:numPr>
+          <w:ilvl w:val="0"/>
+          <w:numId w:val="1004"/>
+        </w:numPr>
+        <w:pStyle w:val="Compact"/>
+      </w:pPr>
+      <w:r>
+        <w:rPr>
+          <w:bCs/>
+          <w:b/>
+        </w:rPr>
+        <w:t xml:space="preserve">Visual appearance</w:t>
+      </w:r>
+    </w:p>
+    <w:p>
+      <w:pPr>
+        <w:numPr>
+          <w:ilvl w:val="0"/>
+          <w:numId w:val="1004"/>
+        </w:numPr>
+        <w:pStyle w:val="Compact"/>
+      </w:pPr>
+      <w:r>
+        <w:rPr>
+          <w:bCs/>
+          <w:b/>
+        </w:rPr>
+        <w:t xml:space="preserve">Viscosity</w:t>
+      </w:r>
+    </w:p>
+    <w:p>
+      <w:pPr>
+        <w:numPr>
+          <w:ilvl w:val="0"/>
+          <w:numId w:val="1004"/>
+        </w:numPr>
+        <w:pStyle w:val="Compact"/>
+      </w:pPr>
+      <w:r>
+        <w:rPr>
+          <w:bCs/>
+          <w:b/>
+        </w:rPr>
+        <w:t xml:space="preserve">pH</w:t>
+      </w:r>
+    </w:p>
+    <w:p>
+      <w:pPr>
+        <w:numPr>
+          <w:ilvl w:val="0"/>
+          <w:numId w:val="1004"/>
+        </w:numPr>
+        <w:pStyle w:val="Compact"/>
+      </w:pPr>
+      <w:r>
+        <w:rPr>
+          <w:bCs/>
+          <w:b/>
+        </w:rPr>
+        <w:t xml:space="preserve">Ejaculate volume</w:t>
+      </w:r>
+    </w:p>
+    <w:p>
+      <w:pPr>
         <w:pStyle w:val="FirstParagraph"/>
+      </w:pPr>
+      <w:r>
+        <w:t xml:space="preserve">Depending on the software screen and configuration, the system may also display</w:t>
+      </w:r>
+      <w:r>
+        <w:t xml:space="preserve"> </w:t>
+      </w:r>
+      <w:r>
+        <w:rPr>
+          <w:bCs/>
+          <w:b/>
+        </w:rPr>
+        <w:t xml:space="preserve">Total Sperm Number</w:t>
+      </w:r>
+      <w:r>
+        <w:t xml:space="preserve"> </w:t>
+      </w:r>
+      <w:r>
+        <w:t xml:space="preserve">calculated from the analysis result and entered sample volume.</w:t>
+      </w:r>
+    </w:p>
+    <w:p>
+      <w:pPr>
+        <w:pStyle w:val="BodyText"/>
       </w:pPr>
       <w:r>
         <w:t xml:space="preserve">Sample information is optional. However, entering complete information is recommended when the result will be reviewed, printed, exported, or linked to external laboratory records.</w:t>
@@ -1340,8 +1460,72 @@
         <w:pStyle w:val="Compact"/>
       </w:pPr>
       <w:r>
+        <w:rPr>
+          <w:bCs/>
+          <w:b/>
+        </w:rPr>
+        <w:t xml:space="preserve">DCL</w:t>
+      </w:r>
+      <w:r>
+        <w:t xml:space="preserve">: Distance along the curvilinear path</w:t>
+      </w:r>
+    </w:p>
+    <w:p>
+      <w:pPr>
+        <w:numPr>
+          <w:ilvl w:val="0"/>
+          <w:numId w:val="1007"/>
+        </w:numPr>
+        <w:pStyle w:val="Compact"/>
+      </w:pPr>
+      <w:r>
+        <w:rPr>
+          <w:bCs/>
+          <w:b/>
+        </w:rPr>
+        <w:t xml:space="preserve">DSL</w:t>
+      </w:r>
+      <w:r>
+        <w:t xml:space="preserve">: Distance along the straight-line path</w:t>
+      </w:r>
+    </w:p>
+    <w:p>
+      <w:pPr>
+        <w:numPr>
+          <w:ilvl w:val="0"/>
+          <w:numId w:val="1007"/>
+        </w:numPr>
+        <w:pStyle w:val="Compact"/>
+      </w:pPr>
+      <w:r>
+        <w:rPr>
+          <w:bCs/>
+          <w:b/>
+        </w:rPr>
+        <w:t xml:space="preserve">DAP</w:t>
+      </w:r>
+      <w:r>
+        <w:t xml:space="preserve">: Distance along the average path</w:t>
+      </w:r>
+    </w:p>
+    <w:p>
+      <w:pPr>
+        <w:numPr>
+          <w:ilvl w:val="0"/>
+          <w:numId w:val="1007"/>
+        </w:numPr>
+        <w:pStyle w:val="Compact"/>
+      </w:pPr>
+      <w:r>
+        <w:rPr>
+          <w:bCs/>
+          <w:b/>
+        </w:rPr>
         <w:t xml:space="preserve">VCL</w:t>
       </w:r>
+      <w:r>
+        <w:t xml:space="preserve">: Velocity along the curvilinear path</w:t>
+      </w:r>
     </w:p>
     <w:p>
       <w:pPr>
@@ -1352,8 +1536,15 @@
         <w:pStyle w:val="Compact"/>
       </w:pPr>
       <w:r>
+        <w:rPr>
+          <w:bCs/>
+          <w:b/>
+        </w:rPr>
         <w:t xml:space="preserve">VSL</w:t>
       </w:r>
+      <w:r>
+        <w:t xml:space="preserve">: Velocity along the straight-line path</w:t>
+      </w:r>
     </w:p>
     <w:p>
       <w:pPr>
@@ -1364,8 +1555,15 @@
         <w:pStyle w:val="Compact"/>
       </w:pPr>
       <w:r>
+        <w:rPr>
+          <w:bCs/>
+          <w:b/>
+        </w:rPr>
         <w:t xml:space="preserve">VAP</w:t>
       </w:r>
+      <w:r>
+        <w:t xml:space="preserve">: Velocity along the average path</w:t>
+      </w:r>
     </w:p>
     <w:p>
       <w:pPr>
@@ -1376,8 +1574,72 @@
         <w:pStyle w:val="Compact"/>
       </w:pPr>
       <w:r>
+        <w:rPr>
+          <w:bCs/>
+          <w:b/>
+        </w:rPr>
+        <w:t xml:space="preserve">ALH</w:t>
+      </w:r>
+      <w:r>
+        <w:t xml:space="preserve">: Amplitude of lateral head displacement</w:t>
+      </w:r>
+    </w:p>
+    <w:p>
+      <w:pPr>
+        <w:numPr>
+          <w:ilvl w:val="0"/>
+          <w:numId w:val="1007"/>
+        </w:numPr>
+        <w:pStyle w:val="Compact"/>
+      </w:pPr>
+      <w:r>
+        <w:rPr>
+          <w:bCs/>
+          <w:b/>
+        </w:rPr>
+        <w:t xml:space="preserve">MAD</w:t>
+      </w:r>
+      <w:r>
+        <w:t xml:space="preserve">: Mean angular displacement</w:t>
+      </w:r>
+    </w:p>
+    <w:p>
+      <w:pPr>
+        <w:numPr>
+          <w:ilvl w:val="0"/>
+          <w:numId w:val="1007"/>
+        </w:numPr>
+        <w:pStyle w:val="Compact"/>
+      </w:pPr>
+      <w:r>
+        <w:rPr>
+          <w:bCs/>
+          <w:b/>
+        </w:rPr>
+        <w:t xml:space="preserve">BCF</w:t>
+      </w:r>
+      <w:r>
+        <w:t xml:space="preserve">: Beat-cross frequency</w:t>
+      </w:r>
+    </w:p>
+    <w:p>
+      <w:pPr>
+        <w:numPr>
+          <w:ilvl w:val="0"/>
+          <w:numId w:val="1007"/>
+        </w:numPr>
+        <w:pStyle w:val="Compact"/>
+      </w:pPr>
+      <w:r>
+        <w:rPr>
+          <w:bCs/>
+          <w:b/>
+        </w:rPr>
         <w:t xml:space="preserve">LIN</w:t>
       </w:r>
+      <w:r>
+        <w:t xml:space="preserve">: Linearity of the curvilinear path</w:t>
+      </w:r>
     </w:p>
     <w:p>
       <w:pPr>
@@ -1388,8 +1650,15 @@
         <w:pStyle w:val="Compact"/>
       </w:pPr>
       <w:r>
+        <w:rPr>
+          <w:bCs/>
+          <w:b/>
+        </w:rPr>
         <w:t xml:space="preserve">STR</w:t>
       </w:r>
+      <w:r>
+        <w:t xml:space="preserve">: Straightness of the average path</w:t>
+      </w:r>
     </w:p>
     <w:p>
       <w:pPr>
@@ -1400,31 +1669,14 @@
         <w:pStyle w:val="Compact"/>
       </w:pPr>
       <w:r>
+        <w:rPr>
+          <w:bCs/>
+          <w:b/>
+        </w:rPr>
         <w:t xml:space="preserve">WOB</w:t>
       </w:r>
-    </w:p>
-    <w:p>
-      <w:pPr>
-        <w:numPr>
-          <w:ilvl w:val="0"/>
-          <w:numId w:val="1007"/>
-        </w:numPr>
-        <w:pStyle w:val="Compact"/>
-      </w:pPr>
-      <w:r>
-        <w:t xml:space="preserve">ALH</w:t>
-      </w:r>
-    </w:p>
-    <w:p>
-      <w:pPr>
-        <w:numPr>
-          <w:ilvl w:val="0"/>
-          <w:numId w:val="1007"/>
-        </w:numPr>
-        <w:pStyle w:val="Compact"/>
-      </w:pPr>
-      <w:r>
-        <w:t xml:space="preserve">BCF</w:t>
+      <w:r>
+        <w:t xml:space="preserve">: Wobble, describing oscillation around the average path</w:t>
       </w:r>
     </w:p>
     <w:p>
@@ -1534,6 +1786,18 @@
         <w:pStyle w:val="Compact"/>
       </w:pPr>
       <w:r>
+        <w:t xml:space="preserve">Midpiece defects</w:t>
+      </w:r>
+    </w:p>
+    <w:p>
+      <w:pPr>
+        <w:numPr>
+          <w:ilvl w:val="0"/>
+          <w:numId w:val="1008"/>
+        </w:numPr>
+        <w:pStyle w:val="Compact"/>
+      </w:pPr>
+      <w:r>
         <w:t xml:space="preserve">Tail defects</w:t>
       </w:r>
     </w:p>
@@ -1558,7 +1822,19 @@
         <w:pStyle w:val="Compact"/>
       </w:pPr>
       <w:r>
-        <w:t xml:space="preserve">Droplet-related findings</w:t>
+        <w:t xml:space="preserve">TZI</w:t>
+      </w:r>
+    </w:p>
+    <w:p>
+      <w:pPr>
+        <w:numPr>
+          <w:ilvl w:val="0"/>
+          <w:numId w:val="1008"/>
+        </w:numPr>
+        <w:pStyle w:val="Compact"/>
+      </w:pPr>
+      <w:r>
+        <w:t xml:space="preserve">SDI</w:t>
       </w:r>
     </w:p>
     <w:p>

</xml_diff>